<commit_message>
METS Data Flow Diagram update and Data Validation Procedures added
METS Data Flow Diagram update and Data Validation Procedures added
</commit_message>
<xml_diff>
--- a/Rapport sur la qualité et la complétude des données.docx
+++ b/Rapport sur la qualité et la complétude des données.docx
@@ -112,7 +112,47 @@
           <w:szCs w:val="22"/>
           <w:lang w:val="fr-FR"/>
         </w:rPr>
-        <w:t>Ce rapport présente l’analyse de la qualité et de la complétude des données enregistrées dans le système METS (Medical Equipment Tracking System) lors du déploiement des équipements médicaux dans la région des Plateaux.</w:t>
+        <w:t>Ce rapport présente l’analyse de la qualité et de la complétude des données enregistrées dans le système METS (</w:t>
+      </w:r>
+      <w:proofErr w:type="spellStart"/>
+      <w:r>
+        <w:rPr>
+          <w:rFonts w:ascii="Calibri" w:hAnsi="Calibri" w:cs="Calibri"/>
+          <w:sz w:val="22"/>
+          <w:szCs w:val="22"/>
+          <w:lang w:val="fr-FR"/>
+        </w:rPr>
+        <w:t>Medical</w:t>
+      </w:r>
+      <w:proofErr w:type="spellEnd"/>
+      <w:r>
+        <w:rPr>
+          <w:rFonts w:ascii="Calibri" w:hAnsi="Calibri" w:cs="Calibri"/>
+          <w:sz w:val="22"/>
+          <w:szCs w:val="22"/>
+          <w:lang w:val="fr-FR"/>
+        </w:rPr>
+        <w:t xml:space="preserve"> Equipment </w:t>
+      </w:r>
+      <w:proofErr w:type="spellStart"/>
+      <w:r>
+        <w:rPr>
+          <w:rFonts w:ascii="Calibri" w:hAnsi="Calibri" w:cs="Calibri"/>
+          <w:sz w:val="22"/>
+          <w:szCs w:val="22"/>
+          <w:lang w:val="fr-FR"/>
+        </w:rPr>
+        <w:t>Tracking</w:t>
+      </w:r>
+      <w:proofErr w:type="spellEnd"/>
+      <w:r>
+        <w:rPr>
+          <w:rFonts w:ascii="Calibri" w:hAnsi="Calibri" w:cs="Calibri"/>
+          <w:sz w:val="22"/>
+          <w:szCs w:val="22"/>
+          <w:lang w:val="fr-FR"/>
+        </w:rPr>
+        <w:t xml:space="preserve"> System) lors du déploiement des équipements médicaux dans la région des Plateaux.</w:t>
       </w:r>
     </w:p>
     <w:p>
@@ -155,6 +195,1537 @@
         <w:t>Le rapport formule des recommandations à court, moyen et long terme pour renforcer la qualité des données, sécuriser la traçabilité des équipements et favoriser une utilisation optimale du système METS.</w:t>
       </w:r>
     </w:p>
+    <w:p>
+      <w:pPr>
+        <w:spacing w:after="0"/>
+        <w:rPr>
+          <w:rFonts w:ascii="Calibri" w:hAnsi="Calibri" w:cs="Calibri"/>
+          <w:sz w:val="22"/>
+          <w:szCs w:val="22"/>
+          <w:lang w:val="fr-FR"/>
+        </w:rPr>
+      </w:pPr>
+    </w:p>
+    <w:p>
+      <w:pPr>
+        <w:spacing w:after="0"/>
+        <w:rPr>
+          <w:rFonts w:ascii="Calibri" w:hAnsi="Calibri" w:cs="Calibri"/>
+          <w:b/>
+          <w:bCs/>
+          <w:sz w:val="22"/>
+          <w:szCs w:val="22"/>
+          <w:lang w:val="fr-FR"/>
+        </w:rPr>
+      </w:pPr>
+      <w:r>
+        <w:rPr>
+          <w:rFonts w:ascii="Calibri" w:hAnsi="Calibri" w:cs="Calibri"/>
+          <w:b/>
+          <w:bCs/>
+          <w:sz w:val="22"/>
+          <w:szCs w:val="22"/>
+          <w:lang w:val="fr-FR"/>
+        </w:rPr>
+        <w:t>Architecture du système et assurance qualité des données</w:t>
+      </w:r>
+    </w:p>
+    <w:p>
+      <w:pPr>
+        <w:spacing w:after="0"/>
+        <w:rPr>
+          <w:rFonts w:ascii="Calibri" w:hAnsi="Calibri" w:cs="Calibri"/>
+          <w:sz w:val="22"/>
+          <w:szCs w:val="22"/>
+          <w:lang w:val="fr-FR"/>
+        </w:rPr>
+      </w:pPr>
+      <w:r>
+        <w:rPr>
+          <w:noProof/>
+        </w:rPr>
+        <w:drawing>
+          <wp:anchor distT="0" distB="0" distL="114300" distR="114300" simplePos="0" relativeHeight="251658240" behindDoc="1" locked="0" layoutInCell="1" allowOverlap="1" wp14:anchorId="2F267A1B" wp14:editId="13AF21DE">
+            <wp:simplePos x="0" y="0"/>
+            <wp:positionH relativeFrom="column">
+              <wp:posOffset>0</wp:posOffset>
+            </wp:positionH>
+            <wp:positionV relativeFrom="paragraph">
+              <wp:posOffset>703281</wp:posOffset>
+            </wp:positionV>
+            <wp:extent cx="5546090" cy="2984500"/>
+            <wp:effectExtent l="0" t="0" r="0" b="6350"/>
+            <wp:wrapThrough wrapText="bothSides">
+              <wp:wrapPolygon edited="0">
+                <wp:start x="0" y="0"/>
+                <wp:lineTo x="0" y="21508"/>
+                <wp:lineTo x="21516" y="21508"/>
+                <wp:lineTo x="21516" y="0"/>
+                <wp:lineTo x="0" y="0"/>
+              </wp:wrapPolygon>
+            </wp:wrapThrough>
+            <wp:docPr id="186793176" name="Graphic 1"/>
+            <wp:cNvGraphicFramePr>
+              <a:graphicFrameLocks xmlns:a="http://schemas.openxmlformats.org/drawingml/2006/main" noChangeAspect="1"/>
+            </wp:cNvGraphicFramePr>
+            <a:graphic xmlns:a="http://schemas.openxmlformats.org/drawingml/2006/main">
+              <a:graphicData uri="http://schemas.openxmlformats.org/drawingml/2006/picture">
+                <pic:pic xmlns:pic="http://schemas.openxmlformats.org/drawingml/2006/picture">
+                  <pic:nvPicPr>
+                    <pic:cNvPr id="186793176" name=""/>
+                    <pic:cNvPicPr/>
+                  </pic:nvPicPr>
+                  <pic:blipFill>
+                    <a:blip r:embed="rId7">
+                      <a:extLst>
+                        <a:ext uri="{96DAC541-7B7A-43D3-8B79-37D633B846F1}">
+                          <asvg:svgBlip xmlns:asvg="http://schemas.microsoft.com/office/drawing/2016/SVG/main" r:embed="rId8"/>
+                        </a:ext>
+                      </a:extLst>
+                    </a:blip>
+                    <a:stretch>
+                      <a:fillRect/>
+                    </a:stretch>
+                  </pic:blipFill>
+                  <pic:spPr>
+                    <a:xfrm>
+                      <a:off x="0" y="0"/>
+                      <a:ext cx="5546090" cy="2984500"/>
+                    </a:xfrm>
+                    <a:prstGeom prst="rect">
+                      <a:avLst/>
+                    </a:prstGeom>
+                  </pic:spPr>
+                </pic:pic>
+              </a:graphicData>
+            </a:graphic>
+          </wp:anchor>
+        </w:drawing>
+      </w:r>
+      <w:r>
+        <w:rPr>
+          <w:rFonts w:ascii="Calibri" w:hAnsi="Calibri" w:cs="Calibri"/>
+          <w:sz w:val="22"/>
+          <w:szCs w:val="22"/>
+          <w:lang w:val="fr-FR"/>
+        </w:rPr>
+        <w:t xml:space="preserve">La collecte des données est effectuée au niveau des formations sanitaires et de la plateforme logistique à l’aide de </w:t>
+      </w:r>
+      <w:proofErr w:type="spellStart"/>
+      <w:r>
+        <w:rPr>
+          <w:rFonts w:ascii="Calibri" w:hAnsi="Calibri" w:cs="Calibri"/>
+          <w:sz w:val="22"/>
+          <w:szCs w:val="22"/>
+          <w:lang w:val="fr-FR"/>
+        </w:rPr>
+        <w:t>KoboCollect</w:t>
+      </w:r>
+      <w:proofErr w:type="spellEnd"/>
+      <w:r>
+        <w:rPr>
+          <w:rFonts w:ascii="Calibri" w:hAnsi="Calibri" w:cs="Calibri"/>
+          <w:sz w:val="22"/>
+          <w:szCs w:val="22"/>
+          <w:lang w:val="fr-FR"/>
+        </w:rPr>
+        <w:t>. Les données sont hébergées sur une instance privée Kobo, accessible à l’équipe centrale METS pour la visualisation, l’exportation et les contrôles de cohérence</w:t>
+      </w:r>
+      <w:r>
+        <w:rPr>
+          <w:rFonts w:ascii="Calibri" w:hAnsi="Calibri" w:cs="Calibri"/>
+          <w:sz w:val="22"/>
+          <w:szCs w:val="22"/>
+          <w:lang w:val="fr-FR"/>
+        </w:rPr>
+        <w:t>. Voir Figure 1 ci-dessous.</w:t>
+      </w:r>
+    </w:p>
+    <w:p>
+      <w:pPr>
+        <w:spacing w:after="0"/>
+        <w:jc w:val="center"/>
+        <w:rPr>
+          <w:rFonts w:ascii="Calibri" w:hAnsi="Calibri" w:cs="Calibri"/>
+          <w:b/>
+          <w:bCs/>
+          <w:sz w:val="22"/>
+          <w:szCs w:val="22"/>
+          <w:lang w:val="fr-FR"/>
+        </w:rPr>
+      </w:pPr>
+      <w:r>
+        <w:rPr>
+          <w:rFonts w:ascii="Calibri" w:hAnsi="Calibri" w:cs="Calibri"/>
+          <w:b/>
+          <w:bCs/>
+          <w:sz w:val="22"/>
+          <w:szCs w:val="22"/>
+          <w:lang w:val="fr-FR"/>
+        </w:rPr>
+        <w:t xml:space="preserve">Figure 1. </w:t>
+      </w:r>
+      <w:r>
+        <w:rPr>
+          <w:rFonts w:ascii="Calibri" w:hAnsi="Calibri" w:cs="Calibri"/>
+          <w:b/>
+          <w:bCs/>
+          <w:sz w:val="22"/>
+          <w:szCs w:val="22"/>
+          <w:lang w:val="fr-FR"/>
+        </w:rPr>
+        <w:t>METS – Architecture opérationnelle et cadre d’assurance qualité des données</w:t>
+      </w:r>
+    </w:p>
+    <w:p>
+      <w:pPr>
+        <w:spacing w:after="0"/>
+        <w:jc w:val="center"/>
+        <w:rPr>
+          <w:rFonts w:ascii="Calibri" w:hAnsi="Calibri" w:cs="Calibri"/>
+          <w:b/>
+          <w:bCs/>
+          <w:sz w:val="22"/>
+          <w:szCs w:val="22"/>
+          <w:lang w:val="fr-FR"/>
+        </w:rPr>
+      </w:pPr>
+    </w:p>
+    <w:p>
+      <w:pPr>
+        <w:spacing w:after="0"/>
+        <w:rPr>
+          <w:rFonts w:ascii="Calibri" w:hAnsi="Calibri" w:cs="Calibri"/>
+          <w:sz w:val="22"/>
+          <w:szCs w:val="22"/>
+          <w:lang w:val="fr-FR"/>
+        </w:rPr>
+      </w:pPr>
+      <w:r>
+        <w:rPr>
+          <w:rFonts w:ascii="Calibri" w:hAnsi="Calibri" w:cs="Calibri"/>
+          <w:sz w:val="22"/>
+          <w:szCs w:val="22"/>
+          <w:lang w:val="fr-FR"/>
+        </w:rPr>
+        <w:t xml:space="preserve">Après validation initiale, les données sont synchronisées automatiquement vers </w:t>
+      </w:r>
+      <w:proofErr w:type="spellStart"/>
+      <w:r>
+        <w:rPr>
+          <w:rFonts w:ascii="Calibri" w:hAnsi="Calibri" w:cs="Calibri"/>
+          <w:sz w:val="22"/>
+          <w:szCs w:val="22"/>
+          <w:lang w:val="fr-FR"/>
+        </w:rPr>
+        <w:t>BigQuery</w:t>
+      </w:r>
+      <w:proofErr w:type="spellEnd"/>
+      <w:r>
+        <w:rPr>
+          <w:rFonts w:ascii="Calibri" w:hAnsi="Calibri" w:cs="Calibri"/>
+          <w:sz w:val="22"/>
+          <w:szCs w:val="22"/>
+          <w:lang w:val="fr-FR"/>
+        </w:rPr>
+        <w:t xml:space="preserve"> afin d’alimenter le tableau de bord METS.</w:t>
+      </w:r>
+      <w:r>
+        <w:rPr>
+          <w:rFonts w:ascii="Calibri" w:hAnsi="Calibri" w:cs="Calibri"/>
+          <w:sz w:val="22"/>
+          <w:szCs w:val="22"/>
+          <w:lang w:val="fr-FR"/>
+        </w:rPr>
+        <w:t xml:space="preserve"> </w:t>
+      </w:r>
+      <w:r>
+        <w:rPr>
+          <w:rFonts w:ascii="Calibri" w:hAnsi="Calibri" w:cs="Calibri"/>
+          <w:sz w:val="22"/>
+          <w:szCs w:val="22"/>
+          <w:lang w:val="fr-FR"/>
+        </w:rPr>
+        <w:t>La qualité des données est assurée en amont par des mécanismes intégrés au processus de collecte, notamment :</w:t>
+      </w:r>
+    </w:p>
+    <w:p>
+      <w:pPr>
+        <w:numPr>
+          <w:ilvl w:val="0"/>
+          <w:numId w:val="13"/>
+        </w:numPr>
+        <w:spacing w:after="0"/>
+        <w:rPr>
+          <w:rFonts w:ascii="Calibri" w:hAnsi="Calibri" w:cs="Calibri"/>
+          <w:sz w:val="22"/>
+          <w:szCs w:val="22"/>
+          <w:lang w:val="fr-FR"/>
+        </w:rPr>
+      </w:pPr>
+      <w:r>
+        <w:rPr>
+          <w:rFonts w:ascii="Calibri" w:hAnsi="Calibri" w:cs="Calibri"/>
+          <w:sz w:val="22"/>
+          <w:szCs w:val="22"/>
+          <w:lang w:val="fr-FR"/>
+        </w:rPr>
+        <w:lastRenderedPageBreak/>
+        <w:t>champs obligatoires,</w:t>
+      </w:r>
+    </w:p>
+    <w:p>
+      <w:pPr>
+        <w:numPr>
+          <w:ilvl w:val="0"/>
+          <w:numId w:val="13"/>
+        </w:numPr>
+        <w:spacing w:after="0"/>
+        <w:rPr>
+          <w:rFonts w:ascii="Calibri" w:hAnsi="Calibri" w:cs="Calibri"/>
+          <w:sz w:val="22"/>
+          <w:szCs w:val="22"/>
+          <w:lang w:val="fr-FR"/>
+        </w:rPr>
+      </w:pPr>
+      <w:r>
+        <w:rPr>
+          <w:rFonts w:ascii="Calibri" w:hAnsi="Calibri" w:cs="Calibri"/>
+          <w:sz w:val="22"/>
+          <w:szCs w:val="22"/>
+          <w:lang w:val="fr-FR"/>
+        </w:rPr>
+        <w:t>listes déroulantes standardisées,</w:t>
+      </w:r>
+    </w:p>
+    <w:p>
+      <w:pPr>
+        <w:numPr>
+          <w:ilvl w:val="0"/>
+          <w:numId w:val="13"/>
+        </w:numPr>
+        <w:spacing w:after="0"/>
+        <w:rPr>
+          <w:rFonts w:ascii="Calibri" w:hAnsi="Calibri" w:cs="Calibri"/>
+          <w:sz w:val="22"/>
+          <w:szCs w:val="22"/>
+          <w:lang w:val="fr-FR"/>
+        </w:rPr>
+      </w:pPr>
+      <w:r>
+        <w:rPr>
+          <w:rFonts w:ascii="Calibri" w:hAnsi="Calibri" w:cs="Calibri"/>
+          <w:sz w:val="22"/>
+          <w:szCs w:val="22"/>
+          <w:lang w:val="fr-FR"/>
+        </w:rPr>
+        <w:t>identification unique des équipements via QR code,</w:t>
+      </w:r>
+    </w:p>
+    <w:p>
+      <w:pPr>
+        <w:numPr>
+          <w:ilvl w:val="0"/>
+          <w:numId w:val="13"/>
+        </w:numPr>
+        <w:spacing w:after="0"/>
+        <w:rPr>
+          <w:rFonts w:ascii="Calibri" w:hAnsi="Calibri" w:cs="Calibri"/>
+          <w:sz w:val="22"/>
+          <w:szCs w:val="22"/>
+          <w:lang w:val="fr-FR"/>
+        </w:rPr>
+      </w:pPr>
+      <w:r>
+        <w:rPr>
+          <w:rFonts w:ascii="Calibri" w:hAnsi="Calibri" w:cs="Calibri"/>
+          <w:sz w:val="22"/>
+          <w:szCs w:val="22"/>
+          <w:lang w:val="fr-FR"/>
+        </w:rPr>
+        <w:t>synchronisation automatique,</w:t>
+      </w:r>
+    </w:p>
+    <w:p>
+      <w:pPr>
+        <w:numPr>
+          <w:ilvl w:val="0"/>
+          <w:numId w:val="13"/>
+        </w:numPr>
+        <w:spacing w:after="0"/>
+        <w:rPr>
+          <w:rFonts w:ascii="Calibri" w:hAnsi="Calibri" w:cs="Calibri"/>
+          <w:sz w:val="22"/>
+          <w:szCs w:val="22"/>
+          <w:lang w:val="fr-FR"/>
+        </w:rPr>
+      </w:pPr>
+      <w:r>
+        <w:rPr>
+          <w:rFonts w:ascii="Calibri" w:hAnsi="Calibri" w:cs="Calibri"/>
+          <w:sz w:val="22"/>
+          <w:szCs w:val="22"/>
+          <w:lang w:val="fr-FR"/>
+        </w:rPr>
+        <w:t>contrôles post-collecte,</w:t>
+      </w:r>
+    </w:p>
+    <w:p>
+      <w:pPr>
+        <w:numPr>
+          <w:ilvl w:val="0"/>
+          <w:numId w:val="13"/>
+        </w:numPr>
+        <w:spacing w:after="0"/>
+        <w:rPr>
+          <w:rFonts w:ascii="Calibri" w:hAnsi="Calibri" w:cs="Calibri"/>
+          <w:sz w:val="22"/>
+          <w:szCs w:val="22"/>
+          <w:lang w:val="fr-FR"/>
+        </w:rPr>
+      </w:pPr>
+      <w:r>
+        <w:rPr>
+          <w:rFonts w:ascii="Calibri" w:hAnsi="Calibri" w:cs="Calibri"/>
+          <w:sz w:val="22"/>
+          <w:szCs w:val="22"/>
+          <w:lang w:val="fr-FR"/>
+        </w:rPr>
+        <w:t>vérification terrain ciblée avec les points focaux.</w:t>
+      </w:r>
+    </w:p>
+    <w:p>
+      <w:pPr>
+        <w:spacing w:after="0"/>
+        <w:rPr>
+          <w:rFonts w:ascii="Calibri" w:hAnsi="Calibri" w:cs="Calibri"/>
+          <w:sz w:val="22"/>
+          <w:szCs w:val="22"/>
+          <w:lang w:val="fr-FR"/>
+        </w:rPr>
+      </w:pPr>
+    </w:p>
+    <w:p>
+      <w:pPr>
+        <w:spacing w:after="0"/>
+        <w:rPr>
+          <w:rFonts w:ascii="Calibri" w:hAnsi="Calibri" w:cs="Calibri"/>
+          <w:sz w:val="22"/>
+          <w:szCs w:val="22"/>
+          <w:lang w:val="fr-FR"/>
+        </w:rPr>
+      </w:pPr>
+      <w:r>
+        <w:rPr>
+          <w:rFonts w:ascii="Calibri" w:hAnsi="Calibri" w:cs="Calibri"/>
+          <w:sz w:val="22"/>
+          <w:szCs w:val="22"/>
+          <w:lang w:val="fr-FR"/>
+        </w:rPr>
+        <w:t>Deux formulaires opérationnels structurent le suivi :</w:t>
+      </w:r>
+    </w:p>
+    <w:p>
+      <w:pPr>
+        <w:numPr>
+          <w:ilvl w:val="0"/>
+          <w:numId w:val="14"/>
+        </w:numPr>
+        <w:spacing w:after="0"/>
+        <w:rPr>
+          <w:rFonts w:ascii="Calibri" w:hAnsi="Calibri" w:cs="Calibri"/>
+          <w:sz w:val="22"/>
+          <w:szCs w:val="22"/>
+          <w:lang w:val="fr-FR"/>
+        </w:rPr>
+      </w:pPr>
+      <w:r>
+        <w:rPr>
+          <w:rFonts w:ascii="Calibri" w:hAnsi="Calibri" w:cs="Calibri"/>
+          <w:b/>
+          <w:bCs/>
+          <w:sz w:val="22"/>
+          <w:szCs w:val="22"/>
+          <w:lang w:val="fr-FR"/>
+        </w:rPr>
+        <w:t>Gestion des stocks et livraisons</w:t>
+      </w:r>
+      <w:r>
+        <w:rPr>
+          <w:rFonts w:ascii="Calibri" w:hAnsi="Calibri" w:cs="Calibri"/>
+          <w:sz w:val="22"/>
+          <w:szCs w:val="22"/>
+          <w:lang w:val="fr-FR"/>
+        </w:rPr>
+        <w:t>, renseigné à chaque mouvement logistique ;</w:t>
+      </w:r>
+    </w:p>
+    <w:p>
+      <w:pPr>
+        <w:numPr>
+          <w:ilvl w:val="0"/>
+          <w:numId w:val="14"/>
+        </w:numPr>
+        <w:spacing w:after="0"/>
+        <w:rPr>
+          <w:rFonts w:ascii="Calibri" w:hAnsi="Calibri" w:cs="Calibri"/>
+          <w:sz w:val="22"/>
+          <w:szCs w:val="22"/>
+          <w:lang w:val="fr-FR"/>
+        </w:rPr>
+      </w:pPr>
+      <w:r>
+        <w:rPr>
+          <w:rFonts w:ascii="Calibri" w:hAnsi="Calibri" w:cs="Calibri"/>
+          <w:b/>
+          <w:bCs/>
+          <w:sz w:val="22"/>
+          <w:szCs w:val="22"/>
+          <w:lang w:val="fr-FR"/>
+        </w:rPr>
+        <w:t>Suivi des équipements</w:t>
+      </w:r>
+      <w:r>
+        <w:rPr>
+          <w:rFonts w:ascii="Calibri" w:hAnsi="Calibri" w:cs="Calibri"/>
+          <w:sz w:val="22"/>
+          <w:szCs w:val="22"/>
+          <w:lang w:val="fr-FR"/>
+        </w:rPr>
+        <w:t>, renseigné mensuellement pour les équipements critiques et de manière ad hoc en cas de panne.</w:t>
+      </w:r>
+    </w:p>
+    <w:p>
+      <w:pPr>
+        <w:spacing w:after="0"/>
+        <w:rPr>
+          <w:rFonts w:ascii="Calibri" w:hAnsi="Calibri" w:cs="Calibri"/>
+          <w:sz w:val="22"/>
+          <w:szCs w:val="22"/>
+          <w:lang w:val="fr-FR"/>
+        </w:rPr>
+      </w:pPr>
+      <w:r>
+        <w:rPr>
+          <w:rFonts w:ascii="Calibri" w:hAnsi="Calibri" w:cs="Calibri"/>
+          <w:sz w:val="22"/>
+          <w:szCs w:val="22"/>
+          <w:lang w:val="fr-FR"/>
+        </w:rPr>
+        <w:t>Cette approche combinant validation automatisée et supervision humaine permet d’assurer la complétude, l’exactitude et l’intégrité des données avant leur exploitation analytique.</w:t>
+      </w:r>
+    </w:p>
+    <w:p>
+      <w:pPr>
+        <w:spacing w:after="0"/>
+        <w:rPr>
+          <w:rFonts w:ascii="Calibri" w:hAnsi="Calibri" w:cs="Calibri"/>
+          <w:sz w:val="22"/>
+          <w:szCs w:val="22"/>
+          <w:lang w:val="fr-FR"/>
+        </w:rPr>
+      </w:pPr>
+    </w:p>
+    <w:tbl>
+      <w:tblPr>
+        <w:tblStyle w:val="TableGrid"/>
+        <w:tblW w:w="0" w:type="auto"/>
+        <w:tblBorders>
+          <w:top w:val="none" w:sz="0" w:space="0" w:color="auto"/>
+          <w:left w:val="none" w:sz="0" w:space="0" w:color="auto"/>
+          <w:bottom w:val="none" w:sz="0" w:space="0" w:color="auto"/>
+          <w:right w:val="none" w:sz="0" w:space="0" w:color="auto"/>
+          <w:insideH w:val="none" w:sz="0" w:space="0" w:color="auto"/>
+          <w:insideV w:val="none" w:sz="0" w:space="0" w:color="auto"/>
+        </w:tblBorders>
+        <w:tblLook w:val="04A0" w:firstRow="1" w:lastRow="0" w:firstColumn="1" w:lastColumn="0" w:noHBand="0" w:noVBand="1"/>
+      </w:tblPr>
+      <w:tblGrid>
+        <w:gridCol w:w="9041"/>
+        <w:gridCol w:w="319"/>
+      </w:tblGrid>
+      <w:tr>
+        <w:trPr>
+          <w:trHeight w:val="4997"/>
+        </w:trPr>
+        <w:tc>
+          <w:tcPr>
+            <w:tcW w:w="4329" w:type="dxa"/>
+          </w:tcPr>
+          <w:tbl>
+            <w:tblPr>
+              <w:tblW w:w="8796" w:type="dxa"/>
+              <w:tblBorders>
+                <w:top w:val="single" w:sz="4" w:space="0" w:color="auto"/>
+                <w:left w:val="single" w:sz="4" w:space="0" w:color="auto"/>
+                <w:bottom w:val="single" w:sz="4" w:space="0" w:color="auto"/>
+                <w:right w:val="single" w:sz="4" w:space="0" w:color="auto"/>
+                <w:insideH w:val="single" w:sz="4" w:space="0" w:color="auto"/>
+                <w:insideV w:val="single" w:sz="4" w:space="0" w:color="auto"/>
+              </w:tblBorders>
+              <w:tblCellMar>
+                <w:left w:w="0" w:type="dxa"/>
+                <w:right w:w="0" w:type="dxa"/>
+              </w:tblCellMar>
+              <w:tblLook w:val="0600" w:firstRow="0" w:lastRow="0" w:firstColumn="0" w:lastColumn="0" w:noHBand="1" w:noVBand="1"/>
+            </w:tblPr>
+            <w:tblGrid>
+              <w:gridCol w:w="2586"/>
+              <w:gridCol w:w="6210"/>
+            </w:tblGrid>
+            <w:tr>
+              <w:trPr>
+                <w:trHeight w:val="233"/>
+              </w:trPr>
+              <w:tc>
+                <w:tcPr>
+                  <w:tcW w:w="2586" w:type="dxa"/>
+                  <w:tcMar>
+                    <w:top w:w="72" w:type="dxa"/>
+                    <w:left w:w="144" w:type="dxa"/>
+                    <w:bottom w:w="72" w:type="dxa"/>
+                    <w:right w:w="144" w:type="dxa"/>
+                  </w:tcMar>
+                  <w:vAlign w:val="center"/>
+                  <w:hideMark/>
+                </w:tcPr>
+                <w:p>
+                  <w:pPr>
+                    <w:spacing w:after="0" w:line="240" w:lineRule="auto"/>
+                    <w:rPr>
+                      <w:rFonts w:ascii="Calibri" w:hAnsi="Calibri" w:cs="Calibri"/>
+                      <w:b/>
+                      <w:bCs/>
+                      <w:sz w:val="20"/>
+                      <w:szCs w:val="20"/>
+                      <w:lang w:val="fr-FR"/>
+                    </w:rPr>
+                  </w:pPr>
+                  <w:r>
+                    <w:rPr>
+                      <w:rFonts w:ascii="Calibri" w:hAnsi="Calibri" w:cs="Calibri"/>
+                      <w:b/>
+                      <w:bCs/>
+                      <w:sz w:val="22"/>
+                      <w:szCs w:val="22"/>
+                      <w:lang w:val="fr-FR"/>
+                    </w:rPr>
+                    <w:t>Suivi des équipements</w:t>
+                  </w:r>
+                </w:p>
+              </w:tc>
+              <w:tc>
+                <w:tcPr>
+                  <w:tcW w:w="6210" w:type="dxa"/>
+                  <w:tcMar>
+                    <w:top w:w="72" w:type="dxa"/>
+                    <w:left w:w="144" w:type="dxa"/>
+                    <w:bottom w:w="72" w:type="dxa"/>
+                    <w:right w:w="144" w:type="dxa"/>
+                  </w:tcMar>
+                  <w:vAlign w:val="center"/>
+                  <w:hideMark/>
+                </w:tcPr>
+                <w:p>
+                  <w:pPr>
+                    <w:spacing w:after="0" w:line="240" w:lineRule="auto"/>
+                    <w:jc w:val="center"/>
+                    <w:rPr>
+                      <w:rFonts w:ascii="Calibri" w:hAnsi="Calibri" w:cs="Calibri"/>
+                      <w:b/>
+                      <w:bCs/>
+                      <w:sz w:val="20"/>
+                      <w:szCs w:val="20"/>
+                    </w:rPr>
+                  </w:pPr>
+                  <w:r>
+                    <w:rPr>
+                      <w:rFonts w:ascii="Calibri" w:hAnsi="Calibri" w:cs="Calibri"/>
+                      <w:b/>
+                      <w:bCs/>
+                      <w:sz w:val="20"/>
+                      <w:szCs w:val="20"/>
+                    </w:rPr>
+                    <w:t>Description</w:t>
+                  </w:r>
+                </w:p>
+              </w:tc>
+            </w:tr>
+            <w:tr>
+              <w:trPr>
+                <w:trHeight w:val="344"/>
+              </w:trPr>
+              <w:tc>
+                <w:tcPr>
+                  <w:tcW w:w="2586" w:type="dxa"/>
+                  <w:tcMar>
+                    <w:top w:w="72" w:type="dxa"/>
+                    <w:left w:w="144" w:type="dxa"/>
+                    <w:bottom w:w="72" w:type="dxa"/>
+                    <w:right w:w="144" w:type="dxa"/>
+                  </w:tcMar>
+                  <w:vAlign w:val="center"/>
+                  <w:hideMark/>
+                </w:tcPr>
+                <w:p>
+                  <w:pPr>
+                    <w:spacing w:after="0" w:line="240" w:lineRule="auto"/>
+                    <w:rPr>
+                      <w:rFonts w:ascii="Calibri" w:hAnsi="Calibri" w:cs="Calibri"/>
+                      <w:sz w:val="20"/>
+                      <w:szCs w:val="20"/>
+                    </w:rPr>
+                  </w:pPr>
+                  <w:r>
+                    <w:rPr>
+                      <w:rFonts w:ascii="Segoe UI Emoji" w:hAnsi="Segoe UI Emoji" w:cs="Segoe UI Emoji"/>
+                      <w:sz w:val="20"/>
+                      <w:szCs w:val="20"/>
+                    </w:rPr>
+                    <w:t>🎯</w:t>
+                  </w:r>
+                  <w:r>
+                    <w:rPr>
+                      <w:rFonts w:ascii="Calibri" w:hAnsi="Calibri" w:cs="Calibri"/>
+                      <w:sz w:val="20"/>
+                      <w:szCs w:val="20"/>
+                    </w:rPr>
+                    <w:t xml:space="preserve"> Objectif</w:t>
+                  </w:r>
+                </w:p>
+              </w:tc>
+              <w:tc>
+                <w:tcPr>
+                  <w:tcW w:w="6210" w:type="dxa"/>
+                  <w:tcMar>
+                    <w:top w:w="72" w:type="dxa"/>
+                    <w:left w:w="144" w:type="dxa"/>
+                    <w:bottom w:w="72" w:type="dxa"/>
+                    <w:right w:w="144" w:type="dxa"/>
+                  </w:tcMar>
+                  <w:vAlign w:val="center"/>
+                  <w:hideMark/>
+                </w:tcPr>
+                <w:p>
+                  <w:pPr>
+                    <w:spacing w:after="0" w:line="240" w:lineRule="auto"/>
+                    <w:jc w:val="both"/>
+                    <w:rPr>
+                      <w:rFonts w:ascii="Calibri" w:hAnsi="Calibri" w:cs="Calibri"/>
+                      <w:sz w:val="20"/>
+                      <w:szCs w:val="20"/>
+                      <w:lang w:val="fr-FR"/>
+                    </w:rPr>
+                  </w:pPr>
+                  <w:r>
+                    <w:rPr>
+                      <w:rFonts w:ascii="Calibri" w:hAnsi="Calibri" w:cs="Calibri"/>
+                      <w:sz w:val="20"/>
+                      <w:szCs w:val="20"/>
+                      <w:lang w:val="fr-FR"/>
+                    </w:rPr>
+                    <w:t>Suivre l’état fonctionnel des équipements (en service, en panne, en réparation) et documenter les opérations de maintenance</w:t>
+                  </w:r>
+                </w:p>
+              </w:tc>
+            </w:tr>
+            <w:tr>
+              <w:trPr>
+                <w:trHeight w:val="197"/>
+              </w:trPr>
+              <w:tc>
+                <w:tcPr>
+                  <w:tcW w:w="2586" w:type="dxa"/>
+                  <w:tcMar>
+                    <w:top w:w="72" w:type="dxa"/>
+                    <w:left w:w="144" w:type="dxa"/>
+                    <w:bottom w:w="72" w:type="dxa"/>
+                    <w:right w:w="144" w:type="dxa"/>
+                  </w:tcMar>
+                  <w:vAlign w:val="center"/>
+                  <w:hideMark/>
+                </w:tcPr>
+                <w:p>
+                  <w:pPr>
+                    <w:spacing w:after="0" w:line="240" w:lineRule="auto"/>
+                    <w:rPr>
+                      <w:rFonts w:ascii="Calibri" w:hAnsi="Calibri" w:cs="Calibri"/>
+                      <w:sz w:val="20"/>
+                      <w:szCs w:val="20"/>
+                    </w:rPr>
+                  </w:pPr>
+                  <w:r>
+                    <w:rPr>
+                      <w:rFonts w:ascii="Segoe UI Emoji" w:hAnsi="Segoe UI Emoji" w:cs="Segoe UI Emoji"/>
+                      <w:sz w:val="20"/>
+                      <w:szCs w:val="20"/>
+                    </w:rPr>
+                    <w:t>📍</w:t>
+                  </w:r>
+                  <w:r>
+                    <w:rPr>
+                      <w:rFonts w:ascii="Calibri" w:hAnsi="Calibri" w:cs="Calibri"/>
+                      <w:sz w:val="20"/>
+                      <w:szCs w:val="20"/>
+                    </w:rPr>
+                    <w:t xml:space="preserve"> Point de </w:t>
+                  </w:r>
+                  <w:proofErr w:type="spellStart"/>
+                  <w:r>
+                    <w:rPr>
+                      <w:rFonts w:ascii="Calibri" w:hAnsi="Calibri" w:cs="Calibri"/>
+                      <w:sz w:val="20"/>
+                      <w:szCs w:val="20"/>
+                    </w:rPr>
+                    <w:t>saisie</w:t>
+                  </w:r>
+                  <w:proofErr w:type="spellEnd"/>
+                </w:p>
+              </w:tc>
+              <w:tc>
+                <w:tcPr>
+                  <w:tcW w:w="6210" w:type="dxa"/>
+                  <w:tcMar>
+                    <w:top w:w="72" w:type="dxa"/>
+                    <w:left w:w="144" w:type="dxa"/>
+                    <w:bottom w:w="72" w:type="dxa"/>
+                    <w:right w:w="144" w:type="dxa"/>
+                  </w:tcMar>
+                  <w:vAlign w:val="center"/>
+                  <w:hideMark/>
+                </w:tcPr>
+                <w:p>
+                  <w:pPr>
+                    <w:spacing w:after="0" w:line="240" w:lineRule="auto"/>
+                    <w:jc w:val="both"/>
+                    <w:rPr>
+                      <w:rFonts w:ascii="Calibri" w:hAnsi="Calibri" w:cs="Calibri"/>
+                      <w:sz w:val="20"/>
+                      <w:szCs w:val="20"/>
+                    </w:rPr>
+                  </w:pPr>
+                  <w:r>
+                    <w:rPr>
+                      <w:rFonts w:ascii="Calibri" w:hAnsi="Calibri" w:cs="Calibri"/>
+                      <w:color w:val="FF0000"/>
+                      <w:sz w:val="20"/>
+                      <w:szCs w:val="20"/>
+                    </w:rPr>
+                    <w:t>Formation sanitaire</w:t>
+                  </w:r>
+                </w:p>
+              </w:tc>
+            </w:tr>
+            <w:tr>
+              <w:trPr>
+                <w:trHeight w:val="20"/>
+              </w:trPr>
+              <w:tc>
+                <w:tcPr>
+                  <w:tcW w:w="2586" w:type="dxa"/>
+                  <w:tcMar>
+                    <w:top w:w="72" w:type="dxa"/>
+                    <w:left w:w="144" w:type="dxa"/>
+                    <w:bottom w:w="72" w:type="dxa"/>
+                    <w:right w:w="144" w:type="dxa"/>
+                  </w:tcMar>
+                  <w:vAlign w:val="center"/>
+                  <w:hideMark/>
+                </w:tcPr>
+                <w:p>
+                  <w:pPr>
+                    <w:spacing w:after="0" w:line="240" w:lineRule="auto"/>
+                    <w:rPr>
+                      <w:rFonts w:ascii="Calibri" w:hAnsi="Calibri" w:cs="Calibri"/>
+                      <w:sz w:val="20"/>
+                      <w:szCs w:val="20"/>
+                    </w:rPr>
+                  </w:pPr>
+                  <w:r>
+                    <w:rPr>
+                      <w:rFonts w:ascii="Segoe UI Emoji" w:hAnsi="Segoe UI Emoji" w:cs="Segoe UI Emoji"/>
+                      <w:sz w:val="20"/>
+                      <w:szCs w:val="20"/>
+                    </w:rPr>
+                    <w:t>👤</w:t>
+                  </w:r>
+                  <w:r>
+                    <w:rPr>
+                      <w:rFonts w:ascii="Calibri" w:hAnsi="Calibri" w:cs="Calibri"/>
+                      <w:sz w:val="20"/>
+                      <w:szCs w:val="20"/>
+                    </w:rPr>
+                    <w:t xml:space="preserve"> </w:t>
+                  </w:r>
+                  <w:proofErr w:type="spellStart"/>
+                  <w:r>
+                    <w:rPr>
+                      <w:rFonts w:ascii="Calibri" w:hAnsi="Calibri" w:cs="Calibri"/>
+                      <w:sz w:val="20"/>
+                      <w:szCs w:val="20"/>
+                    </w:rPr>
+                    <w:t>Responsable</w:t>
+                  </w:r>
+                  <w:proofErr w:type="spellEnd"/>
+                </w:p>
+              </w:tc>
+              <w:tc>
+                <w:tcPr>
+                  <w:tcW w:w="6210" w:type="dxa"/>
+                  <w:tcMar>
+                    <w:top w:w="72" w:type="dxa"/>
+                    <w:left w:w="144" w:type="dxa"/>
+                    <w:bottom w:w="72" w:type="dxa"/>
+                    <w:right w:w="144" w:type="dxa"/>
+                  </w:tcMar>
+                  <w:vAlign w:val="center"/>
+                  <w:hideMark/>
+                </w:tcPr>
+                <w:p>
+                  <w:pPr>
+                    <w:spacing w:after="0" w:line="240" w:lineRule="auto"/>
+                    <w:jc w:val="both"/>
+                    <w:rPr>
+                      <w:rFonts w:ascii="Calibri" w:hAnsi="Calibri" w:cs="Calibri"/>
+                      <w:sz w:val="20"/>
+                      <w:szCs w:val="20"/>
+                    </w:rPr>
+                  </w:pPr>
+                  <w:proofErr w:type="spellStart"/>
+                  <w:r>
+                    <w:rPr>
+                      <w:rFonts w:ascii="Calibri" w:hAnsi="Calibri" w:cs="Calibri"/>
+                      <w:sz w:val="20"/>
+                      <w:szCs w:val="20"/>
+                    </w:rPr>
+                    <w:t>Responsable</w:t>
+                  </w:r>
+                  <w:proofErr w:type="spellEnd"/>
+                  <w:r>
+                    <w:rPr>
+                      <w:rFonts w:ascii="Calibri" w:hAnsi="Calibri" w:cs="Calibri"/>
+                      <w:sz w:val="20"/>
+                      <w:szCs w:val="20"/>
+                    </w:rPr>
+                    <w:t xml:space="preserve"> USP</w:t>
+                  </w:r>
+                </w:p>
+              </w:tc>
+            </w:tr>
+            <w:tr>
+              <w:trPr>
+                <w:trHeight w:val="143"/>
+              </w:trPr>
+              <w:tc>
+                <w:tcPr>
+                  <w:tcW w:w="2586" w:type="dxa"/>
+                  <w:tcMar>
+                    <w:top w:w="72" w:type="dxa"/>
+                    <w:left w:w="144" w:type="dxa"/>
+                    <w:bottom w:w="72" w:type="dxa"/>
+                    <w:right w:w="144" w:type="dxa"/>
+                  </w:tcMar>
+                  <w:vAlign w:val="center"/>
+                  <w:hideMark/>
+                </w:tcPr>
+                <w:p>
+                  <w:pPr>
+                    <w:spacing w:after="0" w:line="240" w:lineRule="auto"/>
+                    <w:rPr>
+                      <w:rFonts w:ascii="Calibri" w:hAnsi="Calibri" w:cs="Calibri"/>
+                      <w:sz w:val="20"/>
+                      <w:szCs w:val="20"/>
+                    </w:rPr>
+                  </w:pPr>
+                  <w:r>
+                    <w:rPr>
+                      <w:rFonts w:ascii="Segoe UI Symbol" w:hAnsi="Segoe UI Symbol" w:cs="Segoe UI Symbol"/>
+                      <w:sz w:val="20"/>
+                      <w:szCs w:val="20"/>
+                    </w:rPr>
+                    <w:t>⏱</w:t>
+                  </w:r>
+                  <w:r>
+                    <w:rPr>
+                      <w:rFonts w:ascii="Calibri" w:hAnsi="Calibri" w:cs="Calibri"/>
+                      <w:sz w:val="20"/>
+                      <w:szCs w:val="20"/>
+                    </w:rPr>
+                    <w:t xml:space="preserve"> </w:t>
+                  </w:r>
+                  <w:proofErr w:type="spellStart"/>
+                  <w:r>
+                    <w:rPr>
+                      <w:rFonts w:ascii="Calibri" w:hAnsi="Calibri" w:cs="Calibri"/>
+                      <w:sz w:val="20"/>
+                      <w:szCs w:val="20"/>
+                    </w:rPr>
+                    <w:t>Fréquence</w:t>
+                  </w:r>
+                  <w:proofErr w:type="spellEnd"/>
+                </w:p>
+              </w:tc>
+              <w:tc>
+                <w:tcPr>
+                  <w:tcW w:w="6210" w:type="dxa"/>
+                  <w:tcMar>
+                    <w:top w:w="72" w:type="dxa"/>
+                    <w:left w:w="144" w:type="dxa"/>
+                    <w:bottom w:w="72" w:type="dxa"/>
+                    <w:right w:w="144" w:type="dxa"/>
+                  </w:tcMar>
+                  <w:vAlign w:val="center"/>
+                  <w:hideMark/>
+                </w:tcPr>
+                <w:p>
+                  <w:pPr>
+                    <w:spacing w:after="0" w:line="240" w:lineRule="auto"/>
+                    <w:jc w:val="both"/>
+                    <w:rPr>
+                      <w:rFonts w:ascii="Calibri" w:hAnsi="Calibri" w:cs="Calibri"/>
+                      <w:sz w:val="20"/>
+                      <w:szCs w:val="20"/>
+                      <w:lang w:val="fr-FR"/>
+                    </w:rPr>
+                  </w:pPr>
+                  <w:r>
+                    <w:rPr>
+                      <w:rFonts w:ascii="Calibri" w:hAnsi="Calibri" w:cs="Calibri"/>
+                      <w:sz w:val="20"/>
+                      <w:szCs w:val="20"/>
+                      <w:lang w:val="fr-FR"/>
+                    </w:rPr>
+                    <w:t>Mensuelle pour les équipements critiques + ad hoc en cas de panne</w:t>
+                  </w:r>
+                </w:p>
+              </w:tc>
+            </w:tr>
+          </w:tbl>
+          <w:tbl>
+            <w:tblPr>
+              <w:tblpPr w:leftFromText="180" w:rightFromText="180" w:vertAnchor="text" w:horzAnchor="margin" w:tblpY="135"/>
+              <w:tblOverlap w:val="never"/>
+              <w:tblW w:w="8815" w:type="dxa"/>
+              <w:tblBorders>
+                <w:top w:val="single" w:sz="4" w:space="0" w:color="auto"/>
+                <w:left w:val="single" w:sz="4" w:space="0" w:color="auto"/>
+                <w:bottom w:val="single" w:sz="4" w:space="0" w:color="auto"/>
+                <w:right w:val="single" w:sz="4" w:space="0" w:color="auto"/>
+                <w:insideH w:val="single" w:sz="4" w:space="0" w:color="auto"/>
+                <w:insideV w:val="single" w:sz="4" w:space="0" w:color="auto"/>
+              </w:tblBorders>
+              <w:tblCellMar>
+                <w:left w:w="0" w:type="dxa"/>
+                <w:right w:w="0" w:type="dxa"/>
+              </w:tblCellMar>
+              <w:tblLook w:val="0600" w:firstRow="0" w:lastRow="0" w:firstColumn="0" w:lastColumn="0" w:noHBand="1" w:noVBand="1"/>
+            </w:tblPr>
+            <w:tblGrid>
+              <w:gridCol w:w="2605"/>
+              <w:gridCol w:w="6210"/>
+            </w:tblGrid>
+            <w:tr>
+              <w:trPr>
+                <w:trHeight w:val="98"/>
+              </w:trPr>
+              <w:tc>
+                <w:tcPr>
+                  <w:tcW w:w="2605" w:type="dxa"/>
+                  <w:tcMar>
+                    <w:top w:w="72" w:type="dxa"/>
+                    <w:left w:w="144" w:type="dxa"/>
+                    <w:bottom w:w="72" w:type="dxa"/>
+                    <w:right w:w="144" w:type="dxa"/>
+                  </w:tcMar>
+                  <w:vAlign w:val="center"/>
+                  <w:hideMark/>
+                </w:tcPr>
+                <w:p>
+                  <w:pPr>
+                    <w:spacing w:after="0" w:line="240" w:lineRule="auto"/>
+                    <w:rPr>
+                      <w:rFonts w:ascii="Calibri" w:hAnsi="Calibri" w:cs="Calibri"/>
+                      <w:b/>
+                      <w:bCs/>
+                      <w:sz w:val="20"/>
+                      <w:szCs w:val="20"/>
+                      <w:lang w:val="fr-FR"/>
+                    </w:rPr>
+                  </w:pPr>
+                  <w:r>
+                    <w:rPr>
+                      <w:rFonts w:ascii="Calibri" w:hAnsi="Calibri" w:cs="Calibri"/>
+                      <w:b/>
+                      <w:bCs/>
+                      <w:sz w:val="20"/>
+                      <w:szCs w:val="20"/>
+                      <w:lang w:val="fr-FR"/>
+                    </w:rPr>
+                    <w:t>Gestion des stocks et livraisons</w:t>
+                  </w:r>
+                </w:p>
+              </w:tc>
+              <w:tc>
+                <w:tcPr>
+                  <w:tcW w:w="6210" w:type="dxa"/>
+                  <w:tcMar>
+                    <w:top w:w="72" w:type="dxa"/>
+                    <w:left w:w="144" w:type="dxa"/>
+                    <w:bottom w:w="72" w:type="dxa"/>
+                    <w:right w:w="144" w:type="dxa"/>
+                  </w:tcMar>
+                  <w:vAlign w:val="center"/>
+                  <w:hideMark/>
+                </w:tcPr>
+                <w:p>
+                  <w:pPr>
+                    <w:spacing w:after="0" w:line="240" w:lineRule="auto"/>
+                    <w:jc w:val="center"/>
+                    <w:rPr>
+                      <w:rFonts w:ascii="Calibri" w:hAnsi="Calibri" w:cs="Calibri"/>
+                      <w:b/>
+                      <w:bCs/>
+                      <w:sz w:val="20"/>
+                      <w:szCs w:val="20"/>
+                    </w:rPr>
+                  </w:pPr>
+                  <w:r>
+                    <w:rPr>
+                      <w:rFonts w:ascii="Calibri" w:hAnsi="Calibri" w:cs="Calibri"/>
+                      <w:b/>
+                      <w:bCs/>
+                      <w:sz w:val="20"/>
+                      <w:szCs w:val="20"/>
+                    </w:rPr>
+                    <w:t>Description</w:t>
+                  </w:r>
+                </w:p>
+              </w:tc>
+            </w:tr>
+            <w:tr>
+              <w:trPr>
+                <w:trHeight w:val="241"/>
+              </w:trPr>
+              <w:tc>
+                <w:tcPr>
+                  <w:tcW w:w="2605" w:type="dxa"/>
+                  <w:tcMar>
+                    <w:top w:w="72" w:type="dxa"/>
+                    <w:left w:w="144" w:type="dxa"/>
+                    <w:bottom w:w="72" w:type="dxa"/>
+                    <w:right w:w="144" w:type="dxa"/>
+                  </w:tcMar>
+                  <w:vAlign w:val="center"/>
+                  <w:hideMark/>
+                </w:tcPr>
+                <w:p>
+                  <w:pPr>
+                    <w:spacing w:after="0" w:line="240" w:lineRule="auto"/>
+                    <w:rPr>
+                      <w:rFonts w:ascii="Calibri" w:hAnsi="Calibri" w:cs="Calibri"/>
+                      <w:sz w:val="20"/>
+                      <w:szCs w:val="20"/>
+                    </w:rPr>
+                  </w:pPr>
+                  <w:r>
+                    <w:rPr>
+                      <w:rFonts w:ascii="Segoe UI Emoji" w:hAnsi="Segoe UI Emoji" w:cs="Segoe UI Emoji"/>
+                      <w:sz w:val="20"/>
+                      <w:szCs w:val="20"/>
+                    </w:rPr>
+                    <w:t>🎯</w:t>
+                  </w:r>
+                  <w:r>
+                    <w:rPr>
+                      <w:rFonts w:ascii="Calibri" w:hAnsi="Calibri" w:cs="Calibri"/>
+                      <w:sz w:val="20"/>
+                      <w:szCs w:val="20"/>
+                    </w:rPr>
+                    <w:t xml:space="preserve"> Objectif</w:t>
+                  </w:r>
+                </w:p>
+              </w:tc>
+              <w:tc>
+                <w:tcPr>
+                  <w:tcW w:w="6210" w:type="dxa"/>
+                  <w:tcMar>
+                    <w:top w:w="72" w:type="dxa"/>
+                    <w:left w:w="144" w:type="dxa"/>
+                    <w:bottom w:w="72" w:type="dxa"/>
+                    <w:right w:w="144" w:type="dxa"/>
+                  </w:tcMar>
+                  <w:vAlign w:val="center"/>
+                  <w:hideMark/>
+                </w:tcPr>
+                <w:p>
+                  <w:pPr>
+                    <w:spacing w:after="0" w:line="240" w:lineRule="auto"/>
+                    <w:rPr>
+                      <w:rFonts w:ascii="Calibri" w:hAnsi="Calibri" w:cs="Calibri"/>
+                      <w:sz w:val="20"/>
+                      <w:szCs w:val="20"/>
+                      <w:lang w:val="fr-FR"/>
+                    </w:rPr>
+                  </w:pPr>
+                  <w:r>
+                    <w:rPr>
+                      <w:rFonts w:ascii="Calibri" w:hAnsi="Calibri" w:cs="Calibri"/>
+                      <w:sz w:val="20"/>
+                      <w:szCs w:val="20"/>
+                      <w:lang w:val="fr-FR"/>
+                    </w:rPr>
+                    <w:t>Enregistrer toutes les entrées et sorties d’équipements afin d’assurer la traçabilité logistique</w:t>
+                  </w:r>
+                </w:p>
+              </w:tc>
+            </w:tr>
+            <w:tr>
+              <w:trPr>
+                <w:trHeight w:val="20"/>
+              </w:trPr>
+              <w:tc>
+                <w:tcPr>
+                  <w:tcW w:w="2605" w:type="dxa"/>
+                  <w:tcMar>
+                    <w:top w:w="72" w:type="dxa"/>
+                    <w:left w:w="144" w:type="dxa"/>
+                    <w:bottom w:w="72" w:type="dxa"/>
+                    <w:right w:w="144" w:type="dxa"/>
+                  </w:tcMar>
+                  <w:vAlign w:val="center"/>
+                  <w:hideMark/>
+                </w:tcPr>
+                <w:p>
+                  <w:pPr>
+                    <w:spacing w:after="0" w:line="240" w:lineRule="auto"/>
+                    <w:rPr>
+                      <w:rFonts w:ascii="Calibri" w:hAnsi="Calibri" w:cs="Calibri"/>
+                      <w:sz w:val="20"/>
+                      <w:szCs w:val="20"/>
+                    </w:rPr>
+                  </w:pPr>
+                  <w:r>
+                    <w:rPr>
+                      <w:rFonts w:ascii="Segoe UI Emoji" w:hAnsi="Segoe UI Emoji" w:cs="Segoe UI Emoji"/>
+                      <w:sz w:val="20"/>
+                      <w:szCs w:val="20"/>
+                    </w:rPr>
+                    <w:t>📍</w:t>
+                  </w:r>
+                  <w:r>
+                    <w:rPr>
+                      <w:rFonts w:ascii="Calibri" w:hAnsi="Calibri" w:cs="Calibri"/>
+                      <w:sz w:val="20"/>
+                      <w:szCs w:val="20"/>
+                    </w:rPr>
+                    <w:t xml:space="preserve"> Point de </w:t>
+                  </w:r>
+                  <w:proofErr w:type="spellStart"/>
+                  <w:r>
+                    <w:rPr>
+                      <w:rFonts w:ascii="Calibri" w:hAnsi="Calibri" w:cs="Calibri"/>
+                      <w:sz w:val="20"/>
+                      <w:szCs w:val="20"/>
+                    </w:rPr>
+                    <w:t>saisie</w:t>
+                  </w:r>
+                  <w:proofErr w:type="spellEnd"/>
+                </w:p>
+              </w:tc>
+              <w:tc>
+                <w:tcPr>
+                  <w:tcW w:w="6210" w:type="dxa"/>
+                  <w:tcMar>
+                    <w:top w:w="72" w:type="dxa"/>
+                    <w:left w:w="144" w:type="dxa"/>
+                    <w:bottom w:w="72" w:type="dxa"/>
+                    <w:right w:w="144" w:type="dxa"/>
+                  </w:tcMar>
+                  <w:vAlign w:val="center"/>
+                  <w:hideMark/>
+                </w:tcPr>
+                <w:p>
+                  <w:pPr>
+                    <w:spacing w:after="0" w:line="240" w:lineRule="auto"/>
+                    <w:rPr>
+                      <w:rFonts w:ascii="Calibri" w:hAnsi="Calibri" w:cs="Calibri"/>
+                      <w:sz w:val="20"/>
+                      <w:szCs w:val="20"/>
+                      <w:lang w:val="fr-FR"/>
+                    </w:rPr>
+                  </w:pPr>
+                  <w:r>
+                    <w:rPr>
+                      <w:rFonts w:ascii="Calibri" w:hAnsi="Calibri" w:cs="Calibri"/>
+                      <w:color w:val="FF0000"/>
+                      <w:sz w:val="20"/>
+                      <w:szCs w:val="20"/>
+                      <w:lang w:val="fr-FR"/>
+                    </w:rPr>
+                    <w:t xml:space="preserve">Entrepôt (PIA) et </w:t>
+                  </w:r>
+                  <w:r>
+                    <w:rPr>
+                      <w:rFonts w:ascii="Calibri" w:hAnsi="Calibri" w:cs="Calibri"/>
+                      <w:color w:val="FF0000"/>
+                      <w:sz w:val="20"/>
+                      <w:szCs w:val="20"/>
+                      <w:lang w:val="fr-FR"/>
+                    </w:rPr>
+                    <w:t>F</w:t>
+                  </w:r>
+                  <w:r>
+                    <w:rPr>
+                      <w:rFonts w:ascii="Calibri" w:hAnsi="Calibri" w:cs="Calibri"/>
+                      <w:color w:val="FF0000"/>
+                      <w:sz w:val="20"/>
+                      <w:szCs w:val="20"/>
+                      <w:lang w:val="fr-FR"/>
+                    </w:rPr>
+                    <w:t xml:space="preserve">ormation </w:t>
+                  </w:r>
+                  <w:r>
+                    <w:rPr>
+                      <w:rFonts w:ascii="Calibri" w:hAnsi="Calibri" w:cs="Calibri"/>
+                      <w:color w:val="FF0000"/>
+                      <w:sz w:val="20"/>
+                      <w:szCs w:val="20"/>
+                      <w:lang w:val="fr-FR"/>
+                    </w:rPr>
+                    <w:t>S</w:t>
+                  </w:r>
+                  <w:r>
+                    <w:rPr>
+                      <w:rFonts w:ascii="Calibri" w:hAnsi="Calibri" w:cs="Calibri"/>
+                      <w:color w:val="FF0000"/>
+                      <w:sz w:val="20"/>
+                      <w:szCs w:val="20"/>
+                      <w:lang w:val="fr-FR"/>
+                    </w:rPr>
+                    <w:t>anitaire</w:t>
+                  </w:r>
+                </w:p>
+              </w:tc>
+            </w:tr>
+            <w:tr>
+              <w:trPr>
+                <w:trHeight w:val="20"/>
+              </w:trPr>
+              <w:tc>
+                <w:tcPr>
+                  <w:tcW w:w="2605" w:type="dxa"/>
+                  <w:tcMar>
+                    <w:top w:w="72" w:type="dxa"/>
+                    <w:left w:w="144" w:type="dxa"/>
+                    <w:bottom w:w="72" w:type="dxa"/>
+                    <w:right w:w="144" w:type="dxa"/>
+                  </w:tcMar>
+                  <w:vAlign w:val="center"/>
+                  <w:hideMark/>
+                </w:tcPr>
+                <w:p>
+                  <w:pPr>
+                    <w:spacing w:after="0" w:line="240" w:lineRule="auto"/>
+                    <w:rPr>
+                      <w:rFonts w:ascii="Calibri" w:hAnsi="Calibri" w:cs="Calibri"/>
+                      <w:sz w:val="20"/>
+                      <w:szCs w:val="20"/>
+                    </w:rPr>
+                  </w:pPr>
+                  <w:r>
+                    <w:rPr>
+                      <w:rFonts w:ascii="Segoe UI Emoji" w:hAnsi="Segoe UI Emoji" w:cs="Segoe UI Emoji"/>
+                      <w:sz w:val="20"/>
+                      <w:szCs w:val="20"/>
+                    </w:rPr>
+                    <w:t>👤</w:t>
+                  </w:r>
+                  <w:r>
+                    <w:rPr>
+                      <w:rFonts w:ascii="Calibri" w:hAnsi="Calibri" w:cs="Calibri"/>
+                      <w:sz w:val="20"/>
+                      <w:szCs w:val="20"/>
+                    </w:rPr>
+                    <w:t xml:space="preserve"> </w:t>
+                  </w:r>
+                  <w:proofErr w:type="spellStart"/>
+                  <w:r>
+                    <w:rPr>
+                      <w:rFonts w:ascii="Calibri" w:hAnsi="Calibri" w:cs="Calibri"/>
+                      <w:sz w:val="20"/>
+                      <w:szCs w:val="20"/>
+                    </w:rPr>
+                    <w:t>Responsable</w:t>
+                  </w:r>
+                  <w:proofErr w:type="spellEnd"/>
+                </w:p>
+              </w:tc>
+              <w:tc>
+                <w:tcPr>
+                  <w:tcW w:w="6210" w:type="dxa"/>
+                  <w:tcMar>
+                    <w:top w:w="72" w:type="dxa"/>
+                    <w:left w:w="144" w:type="dxa"/>
+                    <w:bottom w:w="72" w:type="dxa"/>
+                    <w:right w:w="144" w:type="dxa"/>
+                  </w:tcMar>
+                  <w:vAlign w:val="center"/>
+                  <w:hideMark/>
+                </w:tcPr>
+                <w:p>
+                  <w:pPr>
+                    <w:spacing w:after="0" w:line="240" w:lineRule="auto"/>
+                    <w:rPr>
+                      <w:rFonts w:ascii="Calibri" w:hAnsi="Calibri" w:cs="Calibri"/>
+                      <w:sz w:val="20"/>
+                      <w:szCs w:val="20"/>
+                      <w:lang w:val="fr-FR"/>
+                    </w:rPr>
+                  </w:pPr>
+                  <w:r>
+                    <w:rPr>
+                      <w:rFonts w:ascii="Calibri" w:hAnsi="Calibri" w:cs="Calibri"/>
+                      <w:sz w:val="20"/>
+                      <w:szCs w:val="20"/>
+                      <w:lang w:val="fr-FR"/>
+                    </w:rPr>
+                    <w:t>Logisticien (sortie) et Responsable USP (réception)</w:t>
+                  </w:r>
+                </w:p>
+              </w:tc>
+            </w:tr>
+            <w:tr>
+              <w:trPr>
+                <w:trHeight w:val="20"/>
+              </w:trPr>
+              <w:tc>
+                <w:tcPr>
+                  <w:tcW w:w="2605" w:type="dxa"/>
+                  <w:tcMar>
+                    <w:top w:w="72" w:type="dxa"/>
+                    <w:left w:w="144" w:type="dxa"/>
+                    <w:bottom w:w="72" w:type="dxa"/>
+                    <w:right w:w="144" w:type="dxa"/>
+                  </w:tcMar>
+                  <w:vAlign w:val="center"/>
+                  <w:hideMark/>
+                </w:tcPr>
+                <w:p>
+                  <w:pPr>
+                    <w:spacing w:after="0" w:line="240" w:lineRule="auto"/>
+                    <w:rPr>
+                      <w:rFonts w:ascii="Calibri" w:hAnsi="Calibri" w:cs="Calibri"/>
+                      <w:b/>
+                      <w:bCs/>
+                      <w:sz w:val="20"/>
+                      <w:szCs w:val="20"/>
+                    </w:rPr>
+                  </w:pPr>
+                  <w:r>
+                    <w:rPr>
+                      <w:rFonts w:ascii="Segoe UI Symbol" w:hAnsi="Segoe UI Symbol" w:cs="Segoe UI Symbol"/>
+                      <w:b/>
+                      <w:bCs/>
+                      <w:sz w:val="20"/>
+                      <w:szCs w:val="20"/>
+                    </w:rPr>
+                    <w:t>⏱</w:t>
+                  </w:r>
+                  <w:r>
+                    <w:rPr>
+                      <w:rFonts w:ascii="Calibri" w:hAnsi="Calibri" w:cs="Calibri"/>
+                      <w:b/>
+                      <w:bCs/>
+                      <w:sz w:val="20"/>
+                      <w:szCs w:val="20"/>
+                    </w:rPr>
+                    <w:t xml:space="preserve"> </w:t>
+                  </w:r>
+                  <w:proofErr w:type="spellStart"/>
+                  <w:r>
+                    <w:rPr>
+                      <w:rFonts w:ascii="Calibri" w:hAnsi="Calibri" w:cs="Calibri"/>
+                      <w:b/>
+                      <w:bCs/>
+                      <w:sz w:val="20"/>
+                      <w:szCs w:val="20"/>
+                    </w:rPr>
+                    <w:t>Fréquence</w:t>
+                  </w:r>
+                  <w:proofErr w:type="spellEnd"/>
+                </w:p>
+              </w:tc>
+              <w:tc>
+                <w:tcPr>
+                  <w:tcW w:w="6210" w:type="dxa"/>
+                  <w:tcMar>
+                    <w:top w:w="72" w:type="dxa"/>
+                    <w:left w:w="144" w:type="dxa"/>
+                    <w:bottom w:w="72" w:type="dxa"/>
+                    <w:right w:w="144" w:type="dxa"/>
+                  </w:tcMar>
+                  <w:vAlign w:val="center"/>
+                  <w:hideMark/>
+                </w:tcPr>
+                <w:p>
+                  <w:pPr>
+                    <w:spacing w:after="0" w:line="240" w:lineRule="auto"/>
+                    <w:rPr>
+                      <w:rFonts w:ascii="Calibri" w:hAnsi="Calibri" w:cs="Calibri"/>
+                      <w:b/>
+                      <w:bCs/>
+                      <w:sz w:val="20"/>
+                      <w:szCs w:val="20"/>
+                      <w:lang w:val="fr-FR"/>
+                    </w:rPr>
+                  </w:pPr>
+                  <w:r>
+                    <w:rPr>
+                      <w:rFonts w:ascii="Calibri" w:hAnsi="Calibri" w:cs="Calibri"/>
+                      <w:b/>
+                      <w:bCs/>
+                      <w:sz w:val="20"/>
+                      <w:szCs w:val="20"/>
+                      <w:lang w:val="fr-FR"/>
+                    </w:rPr>
+                    <w:t>À chaque livraison ou mouvement d’équipement</w:t>
+                  </w:r>
+                </w:p>
+              </w:tc>
+            </w:tr>
+          </w:tbl>
+          <w:p>
+            <w:pPr>
+              <w:rPr>
+                <w:rFonts w:ascii="Calibri" w:hAnsi="Calibri" w:cs="Calibri"/>
+                <w:b/>
+                <w:bCs/>
+                <w:sz w:val="22"/>
+                <w:szCs w:val="22"/>
+                <w:lang w:val="fr-FR"/>
+              </w:rPr>
+            </w:pPr>
+          </w:p>
+        </w:tc>
+        <w:tc>
+          <w:tcPr>
+            <w:tcW w:w="5031" w:type="dxa"/>
+          </w:tcPr>
+          <w:p>
+            <w:pPr>
+              <w:rPr>
+                <w:rFonts w:ascii="Calibri" w:hAnsi="Calibri" w:cs="Calibri"/>
+                <w:b/>
+                <w:bCs/>
+                <w:sz w:val="22"/>
+                <w:szCs w:val="22"/>
+                <w:lang w:val="fr-FR"/>
+              </w:rPr>
+            </w:pPr>
+          </w:p>
+        </w:tc>
+      </w:tr>
+    </w:tbl>
     <w:p>
       <w:pPr>
         <w:spacing w:after="0"/>
@@ -281,7 +1852,27 @@
           <w:szCs w:val="22"/>
           <w:lang w:val="fr-FR"/>
         </w:rPr>
-        <w:t>les scans QR réalisés au départ de la Plateforme Industrielle d’Adétikopé (PIA) et à l’arrivée dans les formations sanitaires ;</w:t>
+        <w:t>les scans QR réalisés au départ de la Plateforme Industrielle d’</w:t>
+      </w:r>
+      <w:proofErr w:type="spellStart"/>
+      <w:r>
+        <w:rPr>
+          <w:rFonts w:ascii="Calibri" w:hAnsi="Calibri" w:cs="Calibri"/>
+          <w:sz w:val="22"/>
+          <w:szCs w:val="22"/>
+          <w:lang w:val="fr-FR"/>
+        </w:rPr>
+        <w:t>Adétikopé</w:t>
+      </w:r>
+      <w:proofErr w:type="spellEnd"/>
+      <w:r>
+        <w:rPr>
+          <w:rFonts w:ascii="Calibri" w:hAnsi="Calibri" w:cs="Calibri"/>
+          <w:sz w:val="22"/>
+          <w:szCs w:val="22"/>
+          <w:lang w:val="fr-FR"/>
+        </w:rPr>
+        <w:t xml:space="preserve"> (PIA) et à l’arrivée dans les formations sanitaires ;</w:t>
       </w:r>
     </w:p>
     <w:p>
@@ -428,6 +2019,7 @@
           <w:szCs w:val="22"/>
           <w:lang w:val="fr-FR"/>
         </w:rPr>
+        <w:lastRenderedPageBreak/>
         <w:t>Qualité</w:t>
       </w:r>
       <w:r>
@@ -482,6 +2074,214 @@
           <w:rFonts w:ascii="Calibri" w:hAnsi="Calibri" w:cs="Calibri"/>
           <w:b/>
           <w:bCs/>
+          <w:sz w:val="22"/>
+          <w:szCs w:val="22"/>
+          <w:lang w:val="fr-FR"/>
+        </w:rPr>
+      </w:pPr>
+    </w:p>
+    <w:p>
+      <w:pPr>
+        <w:spacing w:after="0"/>
+        <w:rPr>
+          <w:rFonts w:ascii="Calibri" w:hAnsi="Calibri" w:cs="Calibri"/>
+          <w:b/>
+          <w:bCs/>
+          <w:color w:val="FF0000"/>
+          <w:sz w:val="22"/>
+          <w:szCs w:val="22"/>
+          <w:highlight w:val="yellow"/>
+          <w:lang w:val="fr-FR"/>
+        </w:rPr>
+      </w:pPr>
+      <w:r>
+        <w:rPr>
+          <w:rFonts w:ascii="Calibri" w:hAnsi="Calibri" w:cs="Calibri"/>
+          <w:b/>
+          <w:bCs/>
+          <w:color w:val="FF0000"/>
+          <w:sz w:val="22"/>
+          <w:szCs w:val="22"/>
+          <w:highlight w:val="yellow"/>
+          <w:lang w:val="fr-FR"/>
+        </w:rPr>
+        <w:t>Procédures de validation des données</w:t>
+      </w:r>
+    </w:p>
+    <w:p>
+      <w:pPr>
+        <w:spacing w:after="0"/>
+        <w:rPr>
+          <w:rFonts w:ascii="Calibri" w:hAnsi="Calibri" w:cs="Calibri"/>
+          <w:color w:val="FF0000"/>
+          <w:sz w:val="22"/>
+          <w:szCs w:val="22"/>
+          <w:highlight w:val="yellow"/>
+          <w:lang w:val="fr-FR"/>
+        </w:rPr>
+      </w:pPr>
+      <w:r>
+        <w:rPr>
+          <w:rFonts w:ascii="Calibri" w:hAnsi="Calibri" w:cs="Calibri"/>
+          <w:color w:val="FF0000"/>
+          <w:sz w:val="22"/>
+          <w:szCs w:val="22"/>
+          <w:highlight w:val="yellow"/>
+          <w:lang w:val="fr-FR"/>
+        </w:rPr>
+        <w:t xml:space="preserve">La collecte des données est réalisée via </w:t>
+      </w:r>
+      <w:proofErr w:type="spellStart"/>
+      <w:r>
+        <w:rPr>
+          <w:rFonts w:ascii="Calibri" w:hAnsi="Calibri" w:cs="Calibri"/>
+          <w:color w:val="FF0000"/>
+          <w:sz w:val="22"/>
+          <w:szCs w:val="22"/>
+          <w:highlight w:val="yellow"/>
+          <w:lang w:val="fr-FR"/>
+        </w:rPr>
+        <w:t>KoboToolbox</w:t>
+      </w:r>
+      <w:proofErr w:type="spellEnd"/>
+      <w:r>
+        <w:rPr>
+          <w:rFonts w:ascii="Calibri" w:hAnsi="Calibri" w:cs="Calibri"/>
+          <w:color w:val="FF0000"/>
+          <w:sz w:val="22"/>
+          <w:szCs w:val="22"/>
+          <w:highlight w:val="yellow"/>
+          <w:lang w:val="fr-FR"/>
+        </w:rPr>
+        <w:t xml:space="preserve"> à l’aide de formulaires numériques structurés intégrant plusieurs mécanismes de validation en amont. Les champs critiques (statut de l’équipement, localisation, identifiant QR, établissement de santé) sont configurés comme obligatoires afin de garantir la complétude. Les valeurs sont standardisées à travers des listes déroulantes (par exemple, état fonctionnel de l’équipement), limitant les erreurs de saisie.</w:t>
+      </w:r>
+    </w:p>
+    <w:p>
+      <w:pPr>
+        <w:spacing w:after="0"/>
+        <w:rPr>
+          <w:rFonts w:ascii="Calibri" w:hAnsi="Calibri" w:cs="Calibri"/>
+          <w:color w:val="FF0000"/>
+          <w:sz w:val="22"/>
+          <w:szCs w:val="22"/>
+          <w:highlight w:val="yellow"/>
+          <w:lang w:val="fr-FR"/>
+        </w:rPr>
+      </w:pPr>
+    </w:p>
+    <w:p>
+      <w:pPr>
+        <w:spacing w:after="0"/>
+        <w:rPr>
+          <w:rFonts w:ascii="Calibri" w:hAnsi="Calibri" w:cs="Calibri"/>
+          <w:color w:val="FF0000"/>
+          <w:sz w:val="22"/>
+          <w:szCs w:val="22"/>
+          <w:highlight w:val="yellow"/>
+          <w:lang w:val="fr-FR"/>
+        </w:rPr>
+      </w:pPr>
+      <w:r>
+        <w:rPr>
+          <w:rFonts w:ascii="Calibri" w:hAnsi="Calibri" w:cs="Calibri"/>
+          <w:color w:val="FF0000"/>
+          <w:sz w:val="22"/>
+          <w:szCs w:val="22"/>
+          <w:highlight w:val="yellow"/>
+          <w:lang w:val="fr-FR"/>
+        </w:rPr>
+        <w:t>Chaque équipement est identifié par un QR code unique, scanné lors de la sortie de la Plateforme Industrielle d’</w:t>
+      </w:r>
+      <w:proofErr w:type="spellStart"/>
+      <w:r>
+        <w:rPr>
+          <w:rFonts w:ascii="Calibri" w:hAnsi="Calibri" w:cs="Calibri"/>
+          <w:color w:val="FF0000"/>
+          <w:sz w:val="22"/>
+          <w:szCs w:val="22"/>
+          <w:highlight w:val="yellow"/>
+          <w:lang w:val="fr-FR"/>
+        </w:rPr>
+        <w:t>Adétikopé</w:t>
+      </w:r>
+      <w:proofErr w:type="spellEnd"/>
+      <w:r>
+        <w:rPr>
+          <w:rFonts w:ascii="Calibri" w:hAnsi="Calibri" w:cs="Calibri"/>
+          <w:color w:val="FF0000"/>
+          <w:sz w:val="22"/>
+          <w:szCs w:val="22"/>
+          <w:highlight w:val="yellow"/>
+          <w:lang w:val="fr-FR"/>
+        </w:rPr>
+        <w:t xml:space="preserve"> (PIA) et à la réception dans les formations sanitaires, assurant la traçabilité tout au long de la chaîne logistique.</w:t>
+      </w:r>
+    </w:p>
+    <w:p>
+      <w:pPr>
+        <w:spacing w:after="0"/>
+        <w:rPr>
+          <w:rFonts w:ascii="Calibri" w:hAnsi="Calibri" w:cs="Calibri"/>
+          <w:color w:val="FF0000"/>
+          <w:sz w:val="22"/>
+          <w:szCs w:val="22"/>
+          <w:highlight w:val="yellow"/>
+          <w:lang w:val="fr-FR"/>
+        </w:rPr>
+      </w:pPr>
+      <w:r>
+        <w:rPr>
+          <w:rFonts w:ascii="Calibri" w:hAnsi="Calibri" w:cs="Calibri"/>
+          <w:color w:val="FF0000"/>
+          <w:sz w:val="22"/>
+          <w:szCs w:val="22"/>
+          <w:highlight w:val="yellow"/>
+          <w:lang w:val="fr-FR"/>
+        </w:rPr>
+        <w:t>Après collecte, les données font l’objet d’un contrôle de cohérence entre les scans QR, les bordereaux papier et le tableau de bord METS. Les écarts identifiés sont vérifiés manuellement sur le terrain avec les points focaux des districts sanitaires, puis corrigés dans le système.</w:t>
+      </w:r>
+    </w:p>
+    <w:p>
+      <w:pPr>
+        <w:spacing w:after="0"/>
+        <w:rPr>
+          <w:rFonts w:ascii="Calibri" w:hAnsi="Calibri" w:cs="Calibri"/>
+          <w:color w:val="FF0000"/>
+          <w:sz w:val="22"/>
+          <w:szCs w:val="22"/>
+          <w:highlight w:val="yellow"/>
+          <w:lang w:val="fr-FR"/>
+        </w:rPr>
+      </w:pPr>
+    </w:p>
+    <w:p>
+      <w:pPr>
+        <w:spacing w:after="0"/>
+        <w:rPr>
+          <w:rFonts w:ascii="Calibri" w:hAnsi="Calibri" w:cs="Calibri"/>
+          <w:color w:val="FF0000"/>
+          <w:sz w:val="22"/>
+          <w:szCs w:val="22"/>
+          <w:lang w:val="fr-FR"/>
+        </w:rPr>
+      </w:pPr>
+      <w:r>
+        <w:rPr>
+          <w:rFonts w:ascii="Calibri" w:hAnsi="Calibri" w:cs="Calibri"/>
+          <w:color w:val="FF0000"/>
+          <w:sz w:val="22"/>
+          <w:szCs w:val="22"/>
+          <w:highlight w:val="yellow"/>
+          <w:lang w:val="fr-FR"/>
+        </w:rPr>
+        <w:t>Cette approche combine validation automatique au niveau du formulaire, contrôles de cohérence post-collecte et vérification humaine ciblée, afin d’assurer la complétude, l’exactitude et l’intégrité des données avant analyse.</w:t>
+      </w:r>
+    </w:p>
+    <w:p>
+      <w:pPr>
+        <w:spacing w:after="0"/>
+        <w:rPr>
+          <w:rFonts w:ascii="Calibri" w:hAnsi="Calibri" w:cs="Calibri"/>
           <w:sz w:val="22"/>
           <w:szCs w:val="22"/>
           <w:lang w:val="fr-FR"/>
@@ -707,6 +2507,7 @@
                 <w:lang w:val="fr-FR"/>
               </w:rPr>
             </w:pPr>
+            <w:proofErr w:type="spellStart"/>
             <w:r>
               <w:rPr>
                 <w:rFonts w:ascii="Calibri" w:hAnsi="Calibri" w:cs="Calibri"/>
@@ -716,6 +2517,7 @@
               </w:rPr>
               <w:t>Kpédikè</w:t>
             </w:r>
+            <w:proofErr w:type="spellEnd"/>
           </w:p>
         </w:tc>
         <w:tc>
@@ -821,6 +2623,7 @@
                 <w:lang w:val="fr-FR"/>
               </w:rPr>
             </w:pPr>
+            <w:proofErr w:type="spellStart"/>
             <w:r>
               <w:rPr>
                 <w:rFonts w:ascii="Calibri" w:hAnsi="Calibri" w:cs="Calibri"/>
@@ -830,6 +2633,7 @@
               </w:rPr>
               <w:t>Glekope</w:t>
             </w:r>
+            <w:proofErr w:type="spellEnd"/>
           </w:p>
         </w:tc>
         <w:tc>
@@ -935,6 +2739,7 @@
                 <w:lang w:val="fr-FR"/>
               </w:rPr>
             </w:pPr>
+            <w:proofErr w:type="spellStart"/>
             <w:r>
               <w:rPr>
                 <w:rFonts w:ascii="Calibri" w:hAnsi="Calibri" w:cs="Calibri"/>
@@ -944,6 +2749,7 @@
               </w:rPr>
               <w:t>Kologan</w:t>
             </w:r>
+            <w:proofErr w:type="spellEnd"/>
           </w:p>
         </w:tc>
         <w:tc>
@@ -1049,6 +2855,7 @@
                 <w:lang w:val="fr-FR"/>
               </w:rPr>
             </w:pPr>
+            <w:proofErr w:type="spellStart"/>
             <w:r>
               <w:rPr>
                 <w:rFonts w:ascii="Calibri" w:hAnsi="Calibri" w:cs="Calibri"/>
@@ -1058,6 +2865,7 @@
               </w:rPr>
               <w:t>Agoto</w:t>
             </w:r>
+            <w:proofErr w:type="spellEnd"/>
           </w:p>
         </w:tc>
         <w:tc>
@@ -1163,6 +2971,7 @@
                 <w:lang w:val="fr-FR"/>
               </w:rPr>
             </w:pPr>
+            <w:proofErr w:type="spellStart"/>
             <w:r>
               <w:rPr>
                 <w:rFonts w:ascii="Calibri" w:hAnsi="Calibri" w:cs="Calibri"/>
@@ -1172,6 +2981,7 @@
               </w:rPr>
               <w:t>Dindou</w:t>
             </w:r>
+            <w:proofErr w:type="spellEnd"/>
           </w:p>
         </w:tc>
         <w:tc>
@@ -1277,6 +3087,7 @@
                 <w:lang w:val="fr-FR"/>
               </w:rPr>
             </w:pPr>
+            <w:proofErr w:type="spellStart"/>
             <w:r>
               <w:rPr>
                 <w:rFonts w:ascii="Calibri" w:hAnsi="Calibri" w:cs="Calibri"/>
@@ -1286,6 +3097,7 @@
               </w:rPr>
               <w:t>Oké-Ekpa</w:t>
             </w:r>
+            <w:proofErr w:type="spellEnd"/>
           </w:p>
         </w:tc>
         <w:tc>
@@ -1391,6 +3203,7 @@
                 <w:lang w:val="fr-FR"/>
               </w:rPr>
             </w:pPr>
+            <w:proofErr w:type="spellStart"/>
             <w:r>
               <w:rPr>
                 <w:rFonts w:ascii="Calibri" w:hAnsi="Calibri" w:cs="Calibri"/>
@@ -1400,6 +3213,7 @@
               </w:rPr>
               <w:t>Tchadome</w:t>
             </w:r>
+            <w:proofErr w:type="spellEnd"/>
           </w:p>
         </w:tc>
         <w:tc>
@@ -1505,6 +3319,7 @@
                 <w:lang w:val="fr-FR"/>
               </w:rPr>
             </w:pPr>
+            <w:proofErr w:type="spellStart"/>
             <w:r>
               <w:rPr>
                 <w:rFonts w:ascii="Calibri" w:hAnsi="Calibri" w:cs="Calibri"/>
@@ -1512,9 +3327,9 @@
                 <w:szCs w:val="22"/>
                 <w:lang w:val="fr-FR"/>
               </w:rPr>
-              <w:lastRenderedPageBreak/>
               <w:t>Daffo</w:t>
             </w:r>
+            <w:proofErr w:type="spellEnd"/>
           </w:p>
         </w:tc>
         <w:tc>
@@ -1620,6 +3435,7 @@
                 <w:lang w:val="fr-FR"/>
               </w:rPr>
             </w:pPr>
+            <w:proofErr w:type="spellStart"/>
             <w:r>
               <w:rPr>
                 <w:rFonts w:ascii="Calibri" w:hAnsi="Calibri" w:cs="Calibri"/>
@@ -1629,6 +3445,7 @@
               </w:rPr>
               <w:t>Agbonou</w:t>
             </w:r>
+            <w:proofErr w:type="spellEnd"/>
           </w:p>
         </w:tc>
         <w:tc>
@@ -1848,6 +3665,7 @@
                 <w:lang w:val="fr-FR"/>
               </w:rPr>
             </w:pPr>
+            <w:proofErr w:type="spellStart"/>
             <w:r>
               <w:rPr>
                 <w:rFonts w:ascii="Calibri" w:hAnsi="Calibri" w:cs="Calibri"/>
@@ -1857,6 +3675,7 @@
               </w:rPr>
               <w:t>Govie-Akpato</w:t>
             </w:r>
+            <w:proofErr w:type="spellEnd"/>
           </w:p>
         </w:tc>
         <w:tc>
@@ -1949,6 +3768,1050 @@
           <w:rFonts w:ascii="Calibri" w:hAnsi="Calibri" w:cs="Calibri"/>
           <w:b/>
           <w:bCs/>
+          <w:color w:val="FF0000"/>
+          <w:sz w:val="22"/>
+          <w:szCs w:val="22"/>
+          <w:highlight w:val="yellow"/>
+          <w:lang w:val="fr-FR"/>
+        </w:rPr>
+      </w:pPr>
+      <w:r>
+        <w:rPr>
+          <w:rFonts w:ascii="Calibri" w:hAnsi="Calibri" w:cs="Calibri"/>
+          <w:b/>
+          <w:bCs/>
+          <w:color w:val="FF0000"/>
+          <w:sz w:val="22"/>
+          <w:szCs w:val="22"/>
+          <w:highlight w:val="yellow"/>
+          <w:lang w:val="fr-FR"/>
+        </w:rPr>
+        <w:t>3.2 Fréquence de remontée des données (usage opérationnel du système)</w:t>
+      </w:r>
+    </w:p>
+    <w:p>
+      <w:pPr>
+        <w:spacing w:after="0"/>
+        <w:rPr>
+          <w:rFonts w:ascii="Calibri" w:hAnsi="Calibri" w:cs="Calibri"/>
+          <w:color w:val="FF0000"/>
+          <w:sz w:val="22"/>
+          <w:szCs w:val="22"/>
+          <w:highlight w:val="yellow"/>
+          <w:lang w:val="fr-FR"/>
+        </w:rPr>
+      </w:pPr>
+      <w:r>
+        <w:rPr>
+          <w:rFonts w:ascii="Calibri" w:hAnsi="Calibri" w:cs="Calibri"/>
+          <w:color w:val="FF0000"/>
+          <w:sz w:val="22"/>
+          <w:szCs w:val="22"/>
+          <w:highlight w:val="yellow"/>
+          <w:lang w:val="fr-FR"/>
+        </w:rPr>
+        <w:t>Au-delà du premier scan à la réception, l’analyse de la fréquence des scans permet d’évaluer l’appropriation opérationnelle du système METS par les formations sanitaires.</w:t>
+      </w:r>
+    </w:p>
+    <w:p>
+      <w:pPr>
+        <w:spacing w:after="0"/>
+        <w:rPr>
+          <w:rFonts w:ascii="Calibri" w:hAnsi="Calibri" w:cs="Calibri"/>
+          <w:color w:val="FF0000"/>
+          <w:sz w:val="22"/>
+          <w:szCs w:val="22"/>
+          <w:highlight w:val="yellow"/>
+          <w:lang w:val="fr-FR"/>
+        </w:rPr>
+      </w:pPr>
+      <w:r>
+        <w:rPr>
+          <w:rFonts w:ascii="Calibri" w:hAnsi="Calibri" w:cs="Calibri"/>
+          <w:color w:val="FF0000"/>
+          <w:sz w:val="22"/>
+          <w:szCs w:val="22"/>
+          <w:highlight w:val="yellow"/>
+          <w:lang w:val="fr-FR"/>
+        </w:rPr>
+        <w:t>L’extraction du backend Kobo/ODK montre que :</w:t>
+      </w:r>
+    </w:p>
+    <w:p>
+      <w:pPr>
+        <w:numPr>
+          <w:ilvl w:val="0"/>
+          <w:numId w:val="8"/>
+        </w:numPr>
+        <w:spacing w:after="0"/>
+        <w:rPr>
+          <w:rFonts w:ascii="Calibri" w:hAnsi="Calibri" w:cs="Calibri"/>
+          <w:color w:val="FF0000"/>
+          <w:sz w:val="22"/>
+          <w:szCs w:val="22"/>
+          <w:highlight w:val="yellow"/>
+          <w:lang w:val="fr-FR"/>
+        </w:rPr>
+      </w:pPr>
+      <w:r>
+        <w:rPr>
+          <w:rFonts w:ascii="Calibri" w:hAnsi="Calibri" w:cs="Calibri"/>
+          <w:color w:val="FF0000"/>
+          <w:sz w:val="22"/>
+          <w:szCs w:val="22"/>
+          <w:highlight w:val="yellow"/>
+          <w:lang w:val="fr-FR"/>
+        </w:rPr>
+        <w:lastRenderedPageBreak/>
+        <w:t>20</w:t>
+      </w:r>
+      <w:r>
+        <w:rPr>
+          <w:rFonts w:ascii="Calibri" w:hAnsi="Calibri" w:cs="Calibri"/>
+          <w:color w:val="FF0000"/>
+          <w:sz w:val="22"/>
+          <w:szCs w:val="22"/>
+          <w:highlight w:val="yellow"/>
+          <w:lang w:val="fr-FR"/>
+        </w:rPr>
+        <w:t xml:space="preserve"> % des formations sanitaires ont réalisé plus d’un scan pour au moins un équipement (réception + mise à jour ultérieure du statut).</w:t>
+      </w:r>
+    </w:p>
+    <w:p>
+      <w:pPr>
+        <w:numPr>
+          <w:ilvl w:val="0"/>
+          <w:numId w:val="8"/>
+        </w:numPr>
+        <w:spacing w:after="0"/>
+        <w:rPr>
+          <w:rFonts w:ascii="Calibri" w:hAnsi="Calibri" w:cs="Calibri"/>
+          <w:color w:val="FF0000"/>
+          <w:sz w:val="22"/>
+          <w:szCs w:val="22"/>
+          <w:highlight w:val="yellow"/>
+          <w:lang w:val="fr-FR"/>
+        </w:rPr>
+      </w:pPr>
+      <w:r>
+        <w:rPr>
+          <w:rFonts w:ascii="Calibri" w:hAnsi="Calibri" w:cs="Calibri"/>
+          <w:color w:val="FF0000"/>
+          <w:sz w:val="22"/>
+          <w:szCs w:val="22"/>
+          <w:highlight w:val="yellow"/>
+          <w:lang w:val="fr-FR"/>
+        </w:rPr>
+        <w:t>25</w:t>
+      </w:r>
+      <w:r>
+        <w:rPr>
+          <w:rFonts w:ascii="Calibri" w:hAnsi="Calibri" w:cs="Calibri"/>
+          <w:color w:val="FF0000"/>
+          <w:sz w:val="22"/>
+          <w:szCs w:val="22"/>
+          <w:highlight w:val="yellow"/>
+          <w:lang w:val="fr-FR"/>
+        </w:rPr>
+        <w:t xml:space="preserve"> % ont effectué au moins deux scan distinctes sur la période analysée.</w:t>
+      </w:r>
+    </w:p>
+    <w:p>
+      <w:pPr>
+        <w:numPr>
+          <w:ilvl w:val="0"/>
+          <w:numId w:val="8"/>
+        </w:numPr>
+        <w:spacing w:after="0"/>
+        <w:rPr>
+          <w:rFonts w:ascii="Calibri" w:hAnsi="Calibri" w:cs="Calibri"/>
+          <w:color w:val="FF0000"/>
+          <w:sz w:val="22"/>
+          <w:szCs w:val="22"/>
+          <w:highlight w:val="yellow"/>
+          <w:lang w:val="fr-FR"/>
+        </w:rPr>
+      </w:pPr>
+      <w:r>
+        <w:rPr>
+          <w:rFonts w:ascii="Calibri" w:hAnsi="Calibri" w:cs="Calibri"/>
+          <w:color w:val="FF0000"/>
+          <w:sz w:val="22"/>
+          <w:szCs w:val="22"/>
+          <w:highlight w:val="yellow"/>
+          <w:lang w:val="fr-FR"/>
+        </w:rPr>
+        <w:t xml:space="preserve">En moyenne, chaque équipement scanné a fait l’objet de </w:t>
+      </w:r>
+      <w:r>
+        <w:rPr>
+          <w:rFonts w:ascii="Calibri" w:hAnsi="Calibri" w:cs="Calibri"/>
+          <w:color w:val="FF0000"/>
+          <w:sz w:val="22"/>
+          <w:szCs w:val="22"/>
+          <w:highlight w:val="yellow"/>
+          <w:lang w:val="fr-FR"/>
+        </w:rPr>
+        <w:t>2</w:t>
+      </w:r>
+      <w:r>
+        <w:rPr>
+          <w:rFonts w:ascii="Calibri" w:hAnsi="Calibri" w:cs="Calibri"/>
+          <w:color w:val="FF0000"/>
+          <w:sz w:val="22"/>
+          <w:szCs w:val="22"/>
+          <w:highlight w:val="yellow"/>
+          <w:lang w:val="fr-FR"/>
+        </w:rPr>
+        <w:t xml:space="preserve"> événements de scan</w:t>
+      </w:r>
+      <w:r>
+        <w:rPr>
+          <w:rFonts w:ascii="Calibri" w:hAnsi="Calibri" w:cs="Calibri"/>
+          <w:color w:val="FF0000"/>
+          <w:sz w:val="22"/>
+          <w:szCs w:val="22"/>
+          <w:highlight w:val="yellow"/>
+          <w:lang w:val="fr-FR"/>
+        </w:rPr>
+        <w:t xml:space="preserve"> de la livraison au premier scan de suivi</w:t>
+      </w:r>
+      <w:r>
+        <w:rPr>
+          <w:rFonts w:ascii="Calibri" w:hAnsi="Calibri" w:cs="Calibri"/>
+          <w:color w:val="FF0000"/>
+          <w:sz w:val="22"/>
+          <w:szCs w:val="22"/>
+          <w:highlight w:val="yellow"/>
+          <w:lang w:val="fr-FR"/>
+        </w:rPr>
+        <w:t>.</w:t>
+      </w:r>
+    </w:p>
+    <w:p>
+      <w:pPr>
+        <w:spacing w:after="0"/>
+        <w:rPr>
+          <w:rFonts w:ascii="Calibri" w:hAnsi="Calibri" w:cs="Calibri"/>
+          <w:color w:val="FF0000"/>
+          <w:sz w:val="22"/>
+          <w:szCs w:val="22"/>
+          <w:highlight w:val="yellow"/>
+          <w:lang w:val="fr-FR"/>
+        </w:rPr>
+      </w:pPr>
+      <w:r>
+        <w:rPr>
+          <w:rFonts w:ascii="Calibri" w:hAnsi="Calibri" w:cs="Calibri"/>
+          <w:color w:val="FF0000"/>
+          <w:sz w:val="22"/>
+          <w:szCs w:val="22"/>
+          <w:highlight w:val="yellow"/>
+          <w:lang w:val="fr-FR"/>
+        </w:rPr>
+        <w:t>Ces résultats indiquent que le système n’est pas utilisé uniquement comme un outil de réception ponctuelle, mais commence à être mobilisé pour le suivi continu du parc d’équipements (fonctionnel / non fonctionnel), même si cette pratique reste hétérogène selon les sites.</w:t>
+      </w:r>
+    </w:p>
+    <w:p>
+      <w:pPr>
+        <w:spacing w:after="0"/>
+        <w:rPr>
+          <w:rFonts w:ascii="Calibri" w:hAnsi="Calibri" w:cs="Calibri"/>
+          <w:color w:val="FF0000"/>
+          <w:sz w:val="22"/>
+          <w:szCs w:val="22"/>
+          <w:lang w:val="fr-FR"/>
+        </w:rPr>
+      </w:pPr>
+      <w:r>
+        <w:rPr>
+          <w:rFonts w:ascii="Calibri" w:hAnsi="Calibri" w:cs="Calibri"/>
+          <w:color w:val="FF0000"/>
+          <w:sz w:val="22"/>
+          <w:szCs w:val="22"/>
+          <w:highlight w:val="yellow"/>
+          <w:lang w:val="fr-FR"/>
+        </w:rPr>
+        <w:t>Cette analyse met en évidence un potentiel d’amélioration sur la régularité des mises à jour, qui fait l’objet des recommandations formulées en section 6.</w:t>
+      </w:r>
+    </w:p>
+    <w:p>
+      <w:pPr>
+        <w:spacing w:after="0"/>
+        <w:rPr>
+          <w:rFonts w:ascii="Calibri" w:hAnsi="Calibri" w:cs="Calibri"/>
+          <w:b/>
+          <w:bCs/>
+          <w:sz w:val="22"/>
+          <w:szCs w:val="22"/>
+          <w:lang w:val="fr-FR"/>
+        </w:rPr>
+      </w:pPr>
+    </w:p>
+    <w:p>
+      <w:pPr>
+        <w:spacing w:after="0"/>
+        <w:rPr>
+          <w:rFonts w:ascii="Calibri" w:hAnsi="Calibri" w:cs="Calibri"/>
+          <w:b/>
+          <w:bCs/>
+          <w:color w:val="FF0000"/>
+          <w:sz w:val="22"/>
+          <w:szCs w:val="22"/>
+          <w:highlight w:val="yellow"/>
+          <w:lang w:val="fr-FR"/>
+        </w:rPr>
+      </w:pPr>
+      <w:r>
+        <w:rPr>
+          <w:rFonts w:ascii="Calibri" w:hAnsi="Calibri" w:cs="Calibri"/>
+          <w:b/>
+          <w:bCs/>
+          <w:color w:val="FF0000"/>
+          <w:sz w:val="22"/>
+          <w:szCs w:val="22"/>
+          <w:highlight w:val="yellow"/>
+          <w:lang w:val="fr-FR"/>
+        </w:rPr>
+        <w:t>3.3 Qualité des données saisies dans Kobo/ODK (analyse backend)</w:t>
+      </w:r>
+    </w:p>
+    <w:p>
+      <w:pPr>
+        <w:spacing w:after="0"/>
+        <w:rPr>
+          <w:rFonts w:ascii="Calibri" w:hAnsi="Calibri" w:cs="Calibri"/>
+          <w:color w:val="FF0000"/>
+          <w:sz w:val="22"/>
+          <w:szCs w:val="22"/>
+          <w:highlight w:val="yellow"/>
+          <w:lang w:val="fr-FR"/>
+        </w:rPr>
+      </w:pPr>
+      <w:r>
+        <w:rPr>
+          <w:rFonts w:ascii="Calibri" w:hAnsi="Calibri" w:cs="Calibri"/>
+          <w:color w:val="FF0000"/>
+          <w:sz w:val="22"/>
+          <w:szCs w:val="22"/>
+          <w:highlight w:val="yellow"/>
+          <w:lang w:val="fr-FR"/>
+        </w:rPr>
+        <w:t>Conformément aux observations du relecteur, une analyse directe de la base Kobo/ODK a été réalisée afin d’évaluer la qualité intrinsèque des données saisies par les utilisateurs finaux, indépendamment des contrôles papier.</w:t>
+      </w:r>
+    </w:p>
+    <w:p>
+      <w:pPr>
+        <w:spacing w:after="0"/>
+        <w:rPr>
+          <w:rFonts w:ascii="Calibri" w:hAnsi="Calibri" w:cs="Calibri"/>
+          <w:color w:val="FF0000"/>
+          <w:sz w:val="22"/>
+          <w:szCs w:val="22"/>
+          <w:highlight w:val="yellow"/>
+          <w:lang w:val="fr-FR"/>
+        </w:rPr>
+      </w:pPr>
+      <w:r>
+        <w:rPr>
+          <w:rFonts w:ascii="Calibri" w:hAnsi="Calibri" w:cs="Calibri"/>
+          <w:color w:val="FF0000"/>
+          <w:sz w:val="22"/>
+          <w:szCs w:val="22"/>
+          <w:highlight w:val="yellow"/>
+          <w:lang w:val="fr-FR"/>
+        </w:rPr>
+        <w:t>Les indicateurs suivants ont été examinés :</w:t>
+      </w:r>
+    </w:p>
+    <w:p>
+      <w:pPr>
+        <w:spacing w:after="0"/>
+        <w:rPr>
+          <w:rFonts w:ascii="Calibri" w:hAnsi="Calibri" w:cs="Calibri"/>
+          <w:color w:val="FF0000"/>
+          <w:sz w:val="22"/>
+          <w:szCs w:val="22"/>
+          <w:highlight w:val="yellow"/>
+          <w:lang w:val="fr-FR"/>
+        </w:rPr>
+      </w:pPr>
+      <w:r>
+        <w:rPr>
+          <w:rFonts w:ascii="Calibri" w:hAnsi="Calibri" w:cs="Calibri"/>
+          <w:color w:val="FF0000"/>
+          <w:sz w:val="22"/>
+          <w:szCs w:val="22"/>
+          <w:highlight w:val="yellow"/>
+          <w:lang w:val="fr-FR"/>
+        </w:rPr>
+        <w:t>Complétude des champs critiques</w:t>
+      </w:r>
+    </w:p>
+    <w:p>
+      <w:pPr>
+        <w:numPr>
+          <w:ilvl w:val="0"/>
+          <w:numId w:val="9"/>
+        </w:numPr>
+        <w:spacing w:after="0"/>
+        <w:rPr>
+          <w:rFonts w:ascii="Calibri" w:hAnsi="Calibri" w:cs="Calibri"/>
+          <w:color w:val="FF0000"/>
+          <w:sz w:val="22"/>
+          <w:szCs w:val="22"/>
+          <w:highlight w:val="yellow"/>
+          <w:lang w:val="fr-FR"/>
+        </w:rPr>
+      </w:pPr>
+      <w:r>
+        <w:rPr>
+          <w:rFonts w:ascii="Calibri" w:hAnsi="Calibri" w:cs="Calibri"/>
+          <w:color w:val="FF0000"/>
+          <w:sz w:val="22"/>
+          <w:szCs w:val="22"/>
+          <w:highlight w:val="yellow"/>
+          <w:lang w:val="fr-FR"/>
+        </w:rPr>
+        <w:t xml:space="preserve">Statut de l’équipement : </w:t>
+      </w:r>
+      <w:r>
+        <w:rPr>
+          <w:rFonts w:ascii="Calibri" w:hAnsi="Calibri" w:cs="Calibri"/>
+          <w:color w:val="FF0000"/>
+          <w:sz w:val="22"/>
+          <w:szCs w:val="22"/>
+          <w:highlight w:val="yellow"/>
+          <w:lang w:val="fr-FR"/>
+        </w:rPr>
+        <w:t>100</w:t>
+      </w:r>
+      <w:r>
+        <w:rPr>
+          <w:rFonts w:ascii="Calibri" w:hAnsi="Calibri" w:cs="Calibri"/>
+          <w:color w:val="FF0000"/>
+          <w:sz w:val="22"/>
+          <w:szCs w:val="22"/>
+          <w:highlight w:val="yellow"/>
+          <w:lang w:val="fr-FR"/>
+        </w:rPr>
+        <w:t xml:space="preserve"> %</w:t>
+      </w:r>
+    </w:p>
+    <w:p>
+      <w:pPr>
+        <w:numPr>
+          <w:ilvl w:val="0"/>
+          <w:numId w:val="9"/>
+        </w:numPr>
+        <w:spacing w:after="0"/>
+        <w:rPr>
+          <w:rFonts w:ascii="Calibri" w:hAnsi="Calibri" w:cs="Calibri"/>
+          <w:color w:val="FF0000"/>
+          <w:sz w:val="22"/>
+          <w:szCs w:val="22"/>
+          <w:highlight w:val="yellow"/>
+          <w:lang w:val="fr-FR"/>
+        </w:rPr>
+      </w:pPr>
+      <w:r>
+        <w:rPr>
+          <w:rFonts w:ascii="Calibri" w:hAnsi="Calibri" w:cs="Calibri"/>
+          <w:color w:val="FF0000"/>
+          <w:sz w:val="22"/>
+          <w:szCs w:val="22"/>
+          <w:highlight w:val="yellow"/>
+          <w:lang w:val="fr-FR"/>
+        </w:rPr>
+        <w:t xml:space="preserve">Localisation (formation sanitaire) : </w:t>
+      </w:r>
+      <w:r>
+        <w:rPr>
+          <w:rFonts w:ascii="Calibri" w:hAnsi="Calibri" w:cs="Calibri"/>
+          <w:color w:val="FF0000"/>
+          <w:sz w:val="22"/>
+          <w:szCs w:val="22"/>
+          <w:highlight w:val="yellow"/>
+          <w:lang w:val="fr-FR"/>
+        </w:rPr>
+        <w:t>100</w:t>
+      </w:r>
+      <w:r>
+        <w:rPr>
+          <w:rFonts w:ascii="Calibri" w:hAnsi="Calibri" w:cs="Calibri"/>
+          <w:color w:val="FF0000"/>
+          <w:sz w:val="22"/>
+          <w:szCs w:val="22"/>
+          <w:highlight w:val="yellow"/>
+          <w:lang w:val="fr-FR"/>
+        </w:rPr>
+        <w:t xml:space="preserve"> %</w:t>
+      </w:r>
+    </w:p>
+    <w:p>
+      <w:pPr>
+        <w:numPr>
+          <w:ilvl w:val="0"/>
+          <w:numId w:val="9"/>
+        </w:numPr>
+        <w:spacing w:after="0"/>
+        <w:rPr>
+          <w:rFonts w:ascii="Calibri" w:hAnsi="Calibri" w:cs="Calibri"/>
+          <w:color w:val="FF0000"/>
+          <w:sz w:val="22"/>
+          <w:szCs w:val="22"/>
+          <w:highlight w:val="yellow"/>
+          <w:lang w:val="fr-FR"/>
+        </w:rPr>
+      </w:pPr>
+      <w:r>
+        <w:rPr>
+          <w:rFonts w:ascii="Calibri" w:hAnsi="Calibri" w:cs="Calibri"/>
+          <w:color w:val="FF0000"/>
+          <w:sz w:val="22"/>
+          <w:szCs w:val="22"/>
+          <w:highlight w:val="yellow"/>
+          <w:lang w:val="fr-FR"/>
+        </w:rPr>
+        <w:t xml:space="preserve">Identifiant </w:t>
+      </w:r>
+      <w:proofErr w:type="gramStart"/>
+      <w:r>
+        <w:rPr>
+          <w:rFonts w:ascii="Calibri" w:hAnsi="Calibri" w:cs="Calibri"/>
+          <w:color w:val="FF0000"/>
+          <w:sz w:val="22"/>
+          <w:szCs w:val="22"/>
+          <w:highlight w:val="yellow"/>
+          <w:lang w:val="fr-FR"/>
+        </w:rPr>
+        <w:t>QR:</w:t>
+      </w:r>
+      <w:proofErr w:type="gramEnd"/>
+      <w:r>
+        <w:rPr>
+          <w:rFonts w:ascii="Calibri" w:hAnsi="Calibri" w:cs="Calibri"/>
+          <w:color w:val="FF0000"/>
+          <w:sz w:val="22"/>
+          <w:szCs w:val="22"/>
+          <w:highlight w:val="yellow"/>
+          <w:lang w:val="fr-FR"/>
+        </w:rPr>
+        <w:t xml:space="preserve"> </w:t>
+      </w:r>
+      <w:r>
+        <w:rPr>
+          <w:rFonts w:ascii="Calibri" w:hAnsi="Calibri" w:cs="Calibri"/>
+          <w:color w:val="FF0000"/>
+          <w:sz w:val="22"/>
+          <w:szCs w:val="22"/>
+          <w:highlight w:val="yellow"/>
+          <w:lang w:val="fr-FR"/>
+        </w:rPr>
+        <w:t>100</w:t>
+      </w:r>
+      <w:r>
+        <w:rPr>
+          <w:rFonts w:ascii="Calibri" w:hAnsi="Calibri" w:cs="Calibri"/>
+          <w:color w:val="FF0000"/>
+          <w:sz w:val="22"/>
+          <w:szCs w:val="22"/>
+          <w:highlight w:val="yellow"/>
+          <w:lang w:val="fr-FR"/>
+        </w:rPr>
+        <w:t xml:space="preserve"> %</w:t>
+      </w:r>
+    </w:p>
+    <w:p>
+      <w:pPr>
+        <w:numPr>
+          <w:ilvl w:val="0"/>
+          <w:numId w:val="9"/>
+        </w:numPr>
+        <w:spacing w:after="0"/>
+        <w:rPr>
+          <w:rFonts w:ascii="Calibri" w:hAnsi="Calibri" w:cs="Calibri"/>
+          <w:color w:val="FF0000"/>
+          <w:sz w:val="22"/>
+          <w:szCs w:val="22"/>
+          <w:highlight w:val="yellow"/>
+          <w:lang w:val="fr-FR"/>
+        </w:rPr>
+      </w:pPr>
+      <w:r>
+        <w:rPr>
+          <w:rFonts w:ascii="Calibri" w:hAnsi="Calibri" w:cs="Calibri"/>
+          <w:color w:val="FF0000"/>
+          <w:sz w:val="22"/>
+          <w:szCs w:val="22"/>
+          <w:highlight w:val="yellow"/>
+          <w:lang w:val="fr-FR"/>
+        </w:rPr>
+        <w:t xml:space="preserve">Numéro de série : </w:t>
+      </w:r>
+      <w:r>
+        <w:rPr>
+          <w:rFonts w:ascii="Calibri" w:hAnsi="Calibri" w:cs="Calibri"/>
+          <w:color w:val="FF0000"/>
+          <w:sz w:val="22"/>
+          <w:szCs w:val="22"/>
+          <w:highlight w:val="yellow"/>
+          <w:lang w:val="fr-FR"/>
+        </w:rPr>
+        <w:t>21</w:t>
+      </w:r>
+      <w:r>
+        <w:rPr>
+          <w:rFonts w:ascii="Calibri" w:hAnsi="Calibri" w:cs="Calibri"/>
+          <w:color w:val="FF0000"/>
+          <w:sz w:val="22"/>
+          <w:szCs w:val="22"/>
+          <w:highlight w:val="yellow"/>
+          <w:lang w:val="fr-FR"/>
+        </w:rPr>
+        <w:t xml:space="preserve"> %</w:t>
+      </w:r>
+    </w:p>
+    <w:p>
+      <w:pPr>
+        <w:spacing w:after="0"/>
+        <w:rPr>
+          <w:rFonts w:ascii="Calibri" w:hAnsi="Calibri" w:cs="Calibri"/>
+          <w:color w:val="FF0000"/>
+          <w:sz w:val="22"/>
+          <w:szCs w:val="22"/>
+          <w:highlight w:val="yellow"/>
+          <w:lang w:val="fr-FR"/>
+        </w:rPr>
+      </w:pPr>
+      <w:r>
+        <w:rPr>
+          <w:rFonts w:ascii="Calibri" w:hAnsi="Calibri" w:cs="Calibri"/>
+          <w:color w:val="FF0000"/>
+          <w:sz w:val="22"/>
+          <w:szCs w:val="22"/>
+          <w:highlight w:val="yellow"/>
+          <w:lang w:val="fr-FR"/>
+        </w:rPr>
+        <w:t xml:space="preserve">Le taux moyen de complétude sur les champs obligatoires est estimé à </w:t>
+      </w:r>
+      <w:r>
+        <w:rPr>
+          <w:rFonts w:ascii="Calibri" w:hAnsi="Calibri" w:cs="Calibri"/>
+          <w:color w:val="FF0000"/>
+          <w:sz w:val="22"/>
+          <w:szCs w:val="22"/>
+          <w:highlight w:val="yellow"/>
+          <w:lang w:val="fr-FR"/>
+        </w:rPr>
+        <w:t>75</w:t>
+      </w:r>
+      <w:r>
+        <w:rPr>
+          <w:rFonts w:ascii="Calibri" w:hAnsi="Calibri" w:cs="Calibri"/>
+          <w:color w:val="FF0000"/>
+          <w:sz w:val="22"/>
+          <w:szCs w:val="22"/>
+          <w:highlight w:val="yellow"/>
+          <w:lang w:val="fr-FR"/>
+        </w:rPr>
+        <w:t xml:space="preserve"> %, confirmant l’efficacité des contraintes intégrées au formulaire.</w:t>
+      </w:r>
+    </w:p>
+    <w:p>
+      <w:pPr>
+        <w:spacing w:after="0"/>
+        <w:rPr>
+          <w:rFonts w:ascii="Calibri" w:hAnsi="Calibri" w:cs="Calibri"/>
+          <w:color w:val="FF0000"/>
+          <w:sz w:val="22"/>
+          <w:szCs w:val="22"/>
+          <w:highlight w:val="yellow"/>
+          <w:lang w:val="fr-FR"/>
+        </w:rPr>
+      </w:pPr>
+      <w:r>
+        <w:rPr>
+          <w:rFonts w:ascii="Calibri" w:hAnsi="Calibri" w:cs="Calibri"/>
+          <w:color w:val="FF0000"/>
+          <w:sz w:val="22"/>
+          <w:szCs w:val="22"/>
+          <w:highlight w:val="yellow"/>
+          <w:lang w:val="fr-FR"/>
+        </w:rPr>
+        <w:t>Cohérence des valeurs</w:t>
+      </w:r>
+    </w:p>
+    <w:p>
+      <w:pPr>
+        <w:numPr>
+          <w:ilvl w:val="0"/>
+          <w:numId w:val="10"/>
+        </w:numPr>
+        <w:spacing w:after="0"/>
+        <w:rPr>
+          <w:rFonts w:ascii="Calibri" w:hAnsi="Calibri" w:cs="Calibri"/>
+          <w:color w:val="FF0000"/>
+          <w:sz w:val="22"/>
+          <w:szCs w:val="22"/>
+          <w:highlight w:val="yellow"/>
+          <w:lang w:val="fr-FR"/>
+        </w:rPr>
+      </w:pPr>
+      <w:r>
+        <w:rPr>
+          <w:rFonts w:ascii="Calibri" w:hAnsi="Calibri" w:cs="Calibri"/>
+          <w:color w:val="FF0000"/>
+          <w:sz w:val="22"/>
+          <w:szCs w:val="22"/>
+          <w:highlight w:val="yellow"/>
+          <w:lang w:val="fr-FR"/>
+        </w:rPr>
+        <w:t>20</w:t>
+      </w:r>
+      <w:r>
+        <w:rPr>
+          <w:rFonts w:ascii="Calibri" w:hAnsi="Calibri" w:cs="Calibri"/>
+          <w:color w:val="FF0000"/>
+          <w:sz w:val="22"/>
+          <w:szCs w:val="22"/>
+          <w:highlight w:val="yellow"/>
+          <w:lang w:val="fr-FR"/>
+        </w:rPr>
+        <w:t xml:space="preserve"> % des enregistrements utilisent correctement les listes déroulantes standardisées (état fonctionnel, type d’équipement).</w:t>
+      </w:r>
+    </w:p>
+    <w:p>
+      <w:pPr>
+        <w:numPr>
+          <w:ilvl w:val="0"/>
+          <w:numId w:val="10"/>
+        </w:numPr>
+        <w:spacing w:after="0"/>
+        <w:rPr>
+          <w:rFonts w:ascii="Calibri" w:hAnsi="Calibri" w:cs="Calibri"/>
+          <w:color w:val="FF0000"/>
+          <w:sz w:val="22"/>
+          <w:szCs w:val="22"/>
+          <w:highlight w:val="yellow"/>
+          <w:lang w:val="fr-FR"/>
+        </w:rPr>
+      </w:pPr>
+      <w:r>
+        <w:rPr>
+          <w:rFonts w:ascii="Calibri" w:hAnsi="Calibri" w:cs="Calibri"/>
+          <w:color w:val="FF0000"/>
+          <w:sz w:val="22"/>
+          <w:szCs w:val="22"/>
+          <w:highlight w:val="yellow"/>
+          <w:lang w:val="fr-FR"/>
+        </w:rPr>
+        <w:t>Aucun cas de valeur hors nomenclature n’a été observé sur les champs contraints.</w:t>
+      </w:r>
+    </w:p>
+    <w:p>
+      <w:pPr>
+        <w:spacing w:after="0"/>
+        <w:rPr>
+          <w:rFonts w:ascii="Calibri" w:hAnsi="Calibri" w:cs="Calibri"/>
+          <w:color w:val="FF0000"/>
+          <w:sz w:val="22"/>
+          <w:szCs w:val="22"/>
+          <w:highlight w:val="yellow"/>
+          <w:lang w:val="fr-FR"/>
+        </w:rPr>
+      </w:pPr>
+    </w:p>
+    <w:p>
+      <w:pPr>
+        <w:spacing w:after="0"/>
+        <w:rPr>
+          <w:rFonts w:ascii="Calibri" w:hAnsi="Calibri" w:cs="Calibri"/>
+          <w:color w:val="FF0000"/>
+          <w:sz w:val="22"/>
+          <w:szCs w:val="22"/>
+          <w:highlight w:val="yellow"/>
+          <w:lang w:val="fr-FR"/>
+        </w:rPr>
+      </w:pPr>
+      <w:r>
+        <w:rPr>
+          <w:rFonts w:ascii="Calibri" w:hAnsi="Calibri" w:cs="Calibri"/>
+          <w:color w:val="FF0000"/>
+          <w:sz w:val="22"/>
+          <w:szCs w:val="22"/>
+          <w:highlight w:val="yellow"/>
+          <w:lang w:val="fr-FR"/>
+        </w:rPr>
+        <w:t>Qualité des saisies libres</w:t>
+      </w:r>
+    </w:p>
+    <w:p>
+      <w:pPr>
+        <w:spacing w:after="0"/>
+        <w:rPr>
+          <w:rFonts w:ascii="Calibri" w:hAnsi="Calibri" w:cs="Calibri"/>
+          <w:color w:val="FF0000"/>
+          <w:sz w:val="22"/>
+          <w:szCs w:val="22"/>
+          <w:highlight w:val="yellow"/>
+          <w:lang w:val="fr-FR"/>
+        </w:rPr>
+      </w:pPr>
+      <w:r>
+        <w:rPr>
+          <w:rFonts w:ascii="Calibri" w:hAnsi="Calibri" w:cs="Calibri"/>
+          <w:color w:val="FF0000"/>
+          <w:sz w:val="22"/>
+          <w:szCs w:val="22"/>
+          <w:highlight w:val="yellow"/>
+          <w:lang w:val="fr-FR"/>
+        </w:rPr>
+        <w:t>Un nombre limité de cas présente :</w:t>
+      </w:r>
+    </w:p>
+    <w:p>
+      <w:pPr>
+        <w:numPr>
+          <w:ilvl w:val="0"/>
+          <w:numId w:val="11"/>
+        </w:numPr>
+        <w:spacing w:after="0"/>
+        <w:rPr>
+          <w:rFonts w:ascii="Calibri" w:hAnsi="Calibri" w:cs="Calibri"/>
+          <w:color w:val="FF0000"/>
+          <w:sz w:val="22"/>
+          <w:szCs w:val="22"/>
+          <w:highlight w:val="yellow"/>
+          <w:lang w:val="fr-FR"/>
+        </w:rPr>
+      </w:pPr>
+      <w:r>
+        <w:rPr>
+          <w:rFonts w:ascii="Calibri" w:hAnsi="Calibri" w:cs="Calibri"/>
+          <w:color w:val="FF0000"/>
+          <w:sz w:val="22"/>
+          <w:szCs w:val="22"/>
+          <w:highlight w:val="yellow"/>
+          <w:lang w:val="fr-FR"/>
+        </w:rPr>
+        <w:t>des numéros de série incomplets,</w:t>
+      </w:r>
+    </w:p>
+    <w:p>
+      <w:pPr>
+        <w:numPr>
+          <w:ilvl w:val="0"/>
+          <w:numId w:val="11"/>
+        </w:numPr>
+        <w:spacing w:after="0"/>
+        <w:rPr>
+          <w:rFonts w:ascii="Calibri" w:hAnsi="Calibri" w:cs="Calibri"/>
+          <w:color w:val="FF0000"/>
+          <w:sz w:val="22"/>
+          <w:szCs w:val="22"/>
+          <w:highlight w:val="yellow"/>
+          <w:lang w:val="fr-FR"/>
+        </w:rPr>
+      </w:pPr>
+      <w:r>
+        <w:rPr>
+          <w:rFonts w:ascii="Calibri" w:hAnsi="Calibri" w:cs="Calibri"/>
+          <w:color w:val="FF0000"/>
+          <w:sz w:val="22"/>
+          <w:szCs w:val="22"/>
+          <w:highlight w:val="yellow"/>
+          <w:lang w:val="fr-FR"/>
+        </w:rPr>
+        <w:t>des métadonnées techniques manquantes.</w:t>
+      </w:r>
+    </w:p>
+    <w:p>
+      <w:pPr>
+        <w:spacing w:after="0"/>
+        <w:rPr>
+          <w:rFonts w:ascii="Calibri" w:hAnsi="Calibri" w:cs="Calibri"/>
+          <w:color w:val="FF0000"/>
+          <w:sz w:val="22"/>
+          <w:szCs w:val="22"/>
+          <w:highlight w:val="yellow"/>
+          <w:lang w:val="fr-FR"/>
+        </w:rPr>
+      </w:pPr>
+      <w:r>
+        <w:rPr>
+          <w:rFonts w:ascii="Calibri" w:hAnsi="Calibri" w:cs="Calibri"/>
+          <w:color w:val="FF0000"/>
+          <w:sz w:val="22"/>
+          <w:szCs w:val="22"/>
+          <w:highlight w:val="yellow"/>
+          <w:lang w:val="fr-FR"/>
+        </w:rPr>
+        <w:t>Ces anomalies concernent principalement les équipements livrés avant la standardisation complète du processus QR et font actuellement l’objet d’un rattrapage.</w:t>
+      </w:r>
+    </w:p>
+    <w:p>
+      <w:pPr>
+        <w:spacing w:after="0"/>
+        <w:rPr>
+          <w:rFonts w:ascii="Calibri" w:hAnsi="Calibri" w:cs="Calibri"/>
+          <w:color w:val="FF0000"/>
+          <w:sz w:val="22"/>
+          <w:szCs w:val="22"/>
+          <w:highlight w:val="yellow"/>
+          <w:lang w:val="fr-FR"/>
+        </w:rPr>
+      </w:pPr>
+      <w:r>
+        <w:rPr>
+          <w:rFonts w:ascii="Calibri" w:hAnsi="Calibri" w:cs="Calibri"/>
+          <w:color w:val="FF0000"/>
+          <w:sz w:val="22"/>
+          <w:szCs w:val="22"/>
+          <w:highlight w:val="yellow"/>
+          <w:lang w:val="fr-FR"/>
+        </w:rPr>
+        <w:t>L’ensemble des incohérences détectées dans Kobo/ODK est systématiquement documenté puis résolu à travers un processus de validation terrain impliquant les points focaux des districts sanitaires et l’équipe METS.</w:t>
+      </w:r>
+    </w:p>
+    <w:p>
+      <w:pPr>
+        <w:spacing w:after="0"/>
+        <w:rPr>
+          <w:rFonts w:ascii="Calibri" w:hAnsi="Calibri" w:cs="Calibri"/>
+          <w:color w:val="FF0000"/>
+          <w:sz w:val="22"/>
+          <w:szCs w:val="22"/>
+          <w:highlight w:val="yellow"/>
+          <w:lang w:val="fr-FR"/>
+        </w:rPr>
+      </w:pPr>
+      <w:r>
+        <w:rPr>
+          <w:rFonts w:ascii="Calibri" w:hAnsi="Calibri" w:cs="Calibri"/>
+          <w:color w:val="FF0000"/>
+          <w:sz w:val="22"/>
+          <w:szCs w:val="22"/>
+          <w:highlight w:val="yellow"/>
+          <w:lang w:val="fr-FR"/>
+        </w:rPr>
+        <w:t>Cette analyse backend confirme que la qualité des données est principalement renforcée en amont par :</w:t>
+      </w:r>
+    </w:p>
+    <w:p>
+      <w:pPr>
+        <w:numPr>
+          <w:ilvl w:val="0"/>
+          <w:numId w:val="12"/>
+        </w:numPr>
+        <w:spacing w:after="0"/>
+        <w:rPr>
+          <w:rFonts w:ascii="Calibri" w:hAnsi="Calibri" w:cs="Calibri"/>
+          <w:color w:val="FF0000"/>
+          <w:sz w:val="22"/>
+          <w:szCs w:val="22"/>
+          <w:highlight w:val="yellow"/>
+          <w:lang w:val="fr-FR"/>
+        </w:rPr>
+      </w:pPr>
+      <w:r>
+        <w:rPr>
+          <w:rFonts w:ascii="Calibri" w:hAnsi="Calibri" w:cs="Calibri"/>
+          <w:color w:val="FF0000"/>
+          <w:sz w:val="22"/>
+          <w:szCs w:val="22"/>
+          <w:highlight w:val="yellow"/>
+          <w:lang w:val="fr-FR"/>
+        </w:rPr>
+        <w:t>les champs obligatoires,</w:t>
+      </w:r>
+    </w:p>
+    <w:p>
+      <w:pPr>
+        <w:numPr>
+          <w:ilvl w:val="0"/>
+          <w:numId w:val="12"/>
+        </w:numPr>
+        <w:spacing w:after="0"/>
+        <w:rPr>
+          <w:rFonts w:ascii="Calibri" w:hAnsi="Calibri" w:cs="Calibri"/>
+          <w:color w:val="FF0000"/>
+          <w:sz w:val="22"/>
+          <w:szCs w:val="22"/>
+          <w:highlight w:val="yellow"/>
+          <w:lang w:val="fr-FR"/>
+        </w:rPr>
+      </w:pPr>
+      <w:r>
+        <w:rPr>
+          <w:rFonts w:ascii="Calibri" w:hAnsi="Calibri" w:cs="Calibri"/>
+          <w:color w:val="FF0000"/>
+          <w:sz w:val="22"/>
+          <w:szCs w:val="22"/>
+          <w:highlight w:val="yellow"/>
+          <w:lang w:val="fr-FR"/>
+        </w:rPr>
+        <w:t>les listes déroulantes normalisées,</w:t>
+      </w:r>
+    </w:p>
+    <w:p>
+      <w:pPr>
+        <w:numPr>
+          <w:ilvl w:val="0"/>
+          <w:numId w:val="12"/>
+        </w:numPr>
+        <w:spacing w:after="0"/>
+        <w:rPr>
+          <w:rFonts w:ascii="Calibri" w:hAnsi="Calibri" w:cs="Calibri"/>
+          <w:color w:val="FF0000"/>
+          <w:sz w:val="22"/>
+          <w:szCs w:val="22"/>
+          <w:highlight w:val="yellow"/>
+          <w:lang w:val="fr-FR"/>
+        </w:rPr>
+      </w:pPr>
+      <w:r>
+        <w:rPr>
+          <w:rFonts w:ascii="Calibri" w:hAnsi="Calibri" w:cs="Calibri"/>
+          <w:color w:val="FF0000"/>
+          <w:sz w:val="22"/>
+          <w:szCs w:val="22"/>
+          <w:highlight w:val="yellow"/>
+          <w:lang w:val="fr-FR"/>
+        </w:rPr>
+        <w:lastRenderedPageBreak/>
+        <w:t>l’identification unique par QR code,</w:t>
+      </w:r>
+      <w:r>
+        <w:rPr>
+          <w:rFonts w:ascii="Calibri" w:hAnsi="Calibri" w:cs="Calibri"/>
+          <w:color w:val="FF0000"/>
+          <w:sz w:val="22"/>
+          <w:szCs w:val="22"/>
+          <w:highlight w:val="yellow"/>
+          <w:lang w:val="fr-FR"/>
+        </w:rPr>
+        <w:t xml:space="preserve"> </w:t>
+      </w:r>
+      <w:r>
+        <w:rPr>
+          <w:rFonts w:ascii="Calibri" w:hAnsi="Calibri" w:cs="Calibri"/>
+          <w:color w:val="FF0000"/>
+          <w:sz w:val="22"/>
+          <w:szCs w:val="22"/>
+          <w:highlight w:val="yellow"/>
+          <w:lang w:val="fr-FR"/>
+        </w:rPr>
+        <w:t>et consolidée en aval par des contrôles croisés et une vérification humaine ciblée.</w:t>
+      </w:r>
+    </w:p>
+    <w:p>
+      <w:pPr>
+        <w:spacing w:after="0"/>
+        <w:rPr>
+          <w:rFonts w:ascii="Calibri" w:hAnsi="Calibri" w:cs="Calibri"/>
+          <w:b/>
+          <w:bCs/>
           <w:sz w:val="22"/>
           <w:szCs w:val="22"/>
           <w:lang w:val="fr-FR"/>
@@ -2057,8 +4920,21 @@
           <w:szCs w:val="22"/>
           <w:lang w:val="fr-FR"/>
         </w:rPr>
-        <w:t>Écarts papier–dashboard</w:t>
-      </w:r>
+        <w:t>Écarts papier–</w:t>
+      </w:r>
+      <w:proofErr w:type="spellStart"/>
+      <w:r>
+        <w:rPr>
+          <w:rFonts w:ascii="Calibri" w:hAnsi="Calibri" w:cs="Calibri"/>
+          <w:b/>
+          <w:bCs/>
+          <w:sz w:val="22"/>
+          <w:szCs w:val="22"/>
+          <w:lang w:val="fr-FR"/>
+        </w:rPr>
+        <w:t>dashboard</w:t>
+      </w:r>
+      <w:proofErr w:type="spellEnd"/>
       <w:r>
         <w:rPr>
           <w:rFonts w:ascii="Calibri" w:hAnsi="Calibri" w:cs="Calibri"/>
@@ -2186,6 +5062,30 @@
           <w:lang w:val="fr-FR"/>
         </w:rPr>
       </w:pPr>
+      <w:r>
+        <w:rPr>
+          <w:rFonts w:ascii="Calibri" w:hAnsi="Calibri" w:cs="Calibri"/>
+          <w:b/>
+          <w:bCs/>
+          <w:sz w:val="22"/>
+          <w:szCs w:val="22"/>
+          <w:lang w:val="fr-FR"/>
+        </w:rPr>
+        <w:t>Ces anomalies sont systématiquement documentées, puis résolues à travers un processus de validation terrain impliquant les points focaux et l’équipe METS.</w:t>
+      </w:r>
+    </w:p>
+    <w:p>
+      <w:pPr>
+        <w:spacing w:after="0"/>
+        <w:rPr>
+          <w:rFonts w:ascii="Calibri" w:hAnsi="Calibri" w:cs="Calibri"/>
+          <w:b/>
+          <w:bCs/>
+          <w:sz w:val="22"/>
+          <w:szCs w:val="22"/>
+          <w:lang w:val="fr-FR"/>
+        </w:rPr>
+      </w:pPr>
     </w:p>
     <w:p>
       <w:pPr>
@@ -2331,8 +5231,21 @@
           <w:szCs w:val="22"/>
           <w:lang w:val="fr-FR"/>
         </w:rPr>
-        <w:t>rétro-tagging</w:t>
-      </w:r>
+        <w:t>rétro-</w:t>
+      </w:r>
+      <w:proofErr w:type="spellStart"/>
+      <w:r>
+        <w:rPr>
+          <w:rFonts w:ascii="Calibri" w:hAnsi="Calibri" w:cs="Calibri"/>
+          <w:b/>
+          <w:bCs/>
+          <w:sz w:val="22"/>
+          <w:szCs w:val="22"/>
+          <w:lang w:val="fr-FR"/>
+        </w:rPr>
+        <w:t>tagging</w:t>
+      </w:r>
+      <w:proofErr w:type="spellEnd"/>
       <w:r>
         <w:rPr>
           <w:rFonts w:ascii="Calibri" w:hAnsi="Calibri" w:cs="Calibri"/>
@@ -2423,7 +5336,27 @@
           <w:szCs w:val="22"/>
           <w:lang w:val="fr-FR"/>
         </w:rPr>
-        <w:t>Finaliser le rétro-tagging pour tous les équipements déjà livrés.</w:t>
+        <w:t>Finaliser le rétro-</w:t>
+      </w:r>
+      <w:proofErr w:type="spellStart"/>
+      <w:r>
+        <w:rPr>
+          <w:rFonts w:ascii="Calibri" w:hAnsi="Calibri" w:cs="Calibri"/>
+          <w:sz w:val="22"/>
+          <w:szCs w:val="22"/>
+          <w:lang w:val="fr-FR"/>
+        </w:rPr>
+        <w:t>tagging</w:t>
+      </w:r>
+      <w:proofErr w:type="spellEnd"/>
+      <w:r>
+        <w:rPr>
+          <w:rFonts w:ascii="Calibri" w:hAnsi="Calibri" w:cs="Calibri"/>
+          <w:sz w:val="22"/>
+          <w:szCs w:val="22"/>
+          <w:lang w:val="fr-FR"/>
+        </w:rPr>
+        <w:t xml:space="preserve"> pour tous les équipements déjà livrés.</w:t>
       </w:r>
     </w:p>
     <w:p>
@@ -2611,7 +5544,6 @@
           <w:szCs w:val="22"/>
           <w:lang w:val="fr-FR"/>
         </w:rPr>
-        <w:lastRenderedPageBreak/>
         <w:t>Instituer un audit trimestriel de la qualité et de la complétude des données METS au niveau national.</w:t>
       </w:r>
     </w:p>
@@ -2636,6 +5568,7 @@
           <w:szCs w:val="22"/>
           <w:lang w:val="fr-FR"/>
         </w:rPr>
+        <w:lastRenderedPageBreak/>
         <w:t>7. Conclusion</w:t>
       </w:r>
     </w:p>
@@ -2670,10 +5603,61 @@
         </w:rPr>
       </w:pPr>
     </w:p>
+    <w:p>
+      <w:pPr>
+        <w:spacing w:after="0"/>
+        <w:rPr>
+          <w:rFonts w:ascii="Calibri" w:hAnsi="Calibri" w:cs="Calibri"/>
+          <w:sz w:val="22"/>
+          <w:szCs w:val="22"/>
+          <w:lang w:val="fr-FR"/>
+        </w:rPr>
+      </w:pPr>
+      <w:r>
+        <w:rPr>
+          <w:rFonts w:ascii="Calibri" w:hAnsi="Calibri" w:cs="Calibri"/>
+          <w:sz w:val="22"/>
+          <w:szCs w:val="22"/>
+          <w:lang w:val="fr-FR"/>
+        </w:rPr>
+        <w:t xml:space="preserve">La combinaison de validations intégrées au formulaire </w:t>
+      </w:r>
+      <w:proofErr w:type="spellStart"/>
+      <w:r>
+        <w:rPr>
+          <w:rFonts w:ascii="Calibri" w:hAnsi="Calibri" w:cs="Calibri"/>
+          <w:sz w:val="22"/>
+          <w:szCs w:val="22"/>
+          <w:lang w:val="fr-FR"/>
+        </w:rPr>
+        <w:t>KoboToolbox</w:t>
+      </w:r>
+      <w:proofErr w:type="spellEnd"/>
+      <w:r>
+        <w:rPr>
+          <w:rFonts w:ascii="Calibri" w:hAnsi="Calibri" w:cs="Calibri"/>
+          <w:sz w:val="22"/>
+          <w:szCs w:val="22"/>
+          <w:lang w:val="fr-FR"/>
+        </w:rPr>
+        <w:t>, du QR-codage unique et des contrôles terrain permet d’établir un cadre robuste d’assurance qualité des données.</w:t>
+      </w:r>
+    </w:p>
+    <w:p>
+      <w:pPr>
+        <w:spacing w:after="0"/>
+        <w:rPr>
+          <w:rFonts w:ascii="Calibri" w:hAnsi="Calibri" w:cs="Calibri"/>
+          <w:sz w:val="22"/>
+          <w:szCs w:val="22"/>
+          <w:lang w:val="fr-FR"/>
+        </w:rPr>
+      </w:pPr>
+    </w:p>
     <w:sectPr>
-      <w:footerReference w:type="even" r:id="rId7"/>
-      <w:footerReference w:type="default" r:id="rId8"/>
-      <w:footerReference w:type="first" r:id="rId9"/>
+      <w:footerReference w:type="even" r:id="rId9"/>
+      <w:footerReference w:type="default" r:id="rId10"/>
+      <w:footerReference w:type="first" r:id="rId11"/>
       <w:pgSz w:w="12240" w:h="15840"/>
       <w:pgMar w:top="1440" w:right="1440" w:bottom="1440" w:left="1440" w:header="720" w:footer="720" w:gutter="0"/>
       <w:cols w:space="720"/>
@@ -2714,127 +5698,6 @@
     <w:pPr>
       <w:pStyle w:val="Footer"/>
     </w:pPr>
-    <w:r>
-      <w:rPr>
-        <w:noProof/>
-      </w:rPr>
-      <mc:AlternateContent>
-        <mc:Choice Requires="wps">
-          <w:drawing>
-            <wp:anchor distT="0" distB="0" distL="0" distR="0" simplePos="0" relativeHeight="251659264" behindDoc="0" locked="0" layoutInCell="1" allowOverlap="1" wp14:anchorId="03C67C8C" wp14:editId="4060902C">
-              <wp:simplePos x="635" y="635"/>
-              <wp:positionH relativeFrom="page">
-                <wp:align>right</wp:align>
-              </wp:positionH>
-              <wp:positionV relativeFrom="page">
-                <wp:align>bottom</wp:align>
-              </wp:positionV>
-              <wp:extent cx="1102995" cy="370205"/>
-              <wp:effectExtent l="0" t="0" r="0" b="0"/>
-              <wp:wrapNone/>
-              <wp:docPr id="1792991642" name="Text Box 2" descr="Official Use Only">
-                <a:extLst xmlns:a="http://schemas.openxmlformats.org/drawingml/2006/main">
-                  <a:ext uri="{5AE41FA2-C0FF-4470-9BD4-5FADCA87CBE2}">
-                    <aclsh:classification xmlns:aclsh="http://schemas.microsoft.com/office/drawing/2020/classificationShape" classificationOutcomeType="ftr"/>
-                  </a:ext>
-                </a:extLst>
-              </wp:docPr>
-              <wp:cNvGraphicFramePr/>
-              <a:graphic xmlns:a="http://schemas.openxmlformats.org/drawingml/2006/main">
-                <a:graphicData uri="http://schemas.microsoft.com/office/word/2010/wordprocessingShape">
-                  <wps:wsp>
-                    <wps:cNvSpPr txBox="1"/>
-                    <wps:spPr>
-                      <a:xfrm>
-                        <a:off x="0" y="0"/>
-                        <a:ext cx="1102995" cy="370205"/>
-                      </a:xfrm>
-                      <a:prstGeom prst="rect">
-                        <a:avLst/>
-                      </a:prstGeom>
-                      <a:noFill/>
-                      <a:ln>
-                        <a:noFill/>
-                      </a:ln>
-                    </wps:spPr>
-                    <wps:txbx>
-                      <w:txbxContent>
-                        <w:p>
-                          <w:pPr>
-                            <w:spacing w:after="0"/>
-                            <w:rPr>
-                              <w:rFonts w:ascii="Calibri" w:eastAsia="Calibri" w:hAnsi="Calibri" w:cs="Calibri"/>
-                              <w:noProof/>
-                              <w:color w:val="000000"/>
-                              <w:sz w:val="20"/>
-                              <w:szCs w:val="20"/>
-                            </w:rPr>
-                          </w:pPr>
-                          <w:r>
-                            <w:rPr>
-                              <w:rFonts w:ascii="Calibri" w:eastAsia="Calibri" w:hAnsi="Calibri" w:cs="Calibri"/>
-                              <w:noProof/>
-                              <w:color w:val="000000"/>
-                              <w:sz w:val="20"/>
-                              <w:szCs w:val="20"/>
-                            </w:rPr>
-                            <w:t>Official Use Only</w:t>
-                          </w:r>
-                        </w:p>
-                      </w:txbxContent>
-                    </wps:txbx>
-                    <wps:bodyPr rot="0" spcFirstLastPara="0" vertOverflow="overflow" horzOverflow="overflow" vert="horz" wrap="none" lIns="0" tIns="0" rIns="254000" bIns="190500" numCol="1" spcCol="0" rtlCol="0" fromWordArt="0" anchor="b" anchorCtr="0" forceAA="0" compatLnSpc="1">
-                      <a:prstTxWarp prst="textNoShape">
-                        <a:avLst/>
-                      </a:prstTxWarp>
-                      <a:spAutoFit/>
-                    </wps:bodyPr>
-                  </wps:wsp>
-                </a:graphicData>
-              </a:graphic>
-            </wp:anchor>
-          </w:drawing>
-        </mc:Choice>
-        <mc:Fallback>
-          <w:pict>
-            <v:shapetype w14:anchorId="03C67C8C" id="_x0000_t202" coordsize="21600,21600" o:spt="202" path="m,l,21600r21600,l21600,xe">
-              <v:stroke joinstyle="miter"/>
-              <v:path gradientshapeok="t" o:connecttype="rect"/>
-            </v:shapetype>
-            <v:shape id="Text Box 2" o:spid="_x0000_s1026" type="#_x0000_t202" alt="Official Use Only" style="position:absolute;margin-left:35.65pt;margin-top:0;width:86.85pt;height:29.15pt;z-index:251659264;visibility:visible;mso-wrap-style:none;mso-wrap-distance-left:0;mso-wrap-distance-top:0;mso-wrap-distance-right:0;mso-wrap-distance-bottom:0;mso-position-horizontal:right;mso-position-horizontal-relative:page;mso-position-vertical:bottom;mso-position-vertical-relative:page;v-text-anchor:bottom" o:gfxdata="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" filled="f" stroked="f">
-              <v:fill o:detectmouseclick="t"/>
-              <v:textbox style="mso-fit-shape-to-text:t" inset="0,0,20pt,15pt">
-                <w:txbxContent>
-                  <w:p>
-                    <w:pPr>
-                      <w:spacing w:after="0"/>
-                      <w:rPr>
-                        <w:rFonts w:ascii="Calibri" w:eastAsia="Calibri" w:hAnsi="Calibri" w:cs="Calibri"/>
-                        <w:noProof/>
-                        <w:color w:val="000000"/>
-                        <w:sz w:val="20"/>
-                        <w:szCs w:val="20"/>
-                      </w:rPr>
-                    </w:pPr>
-                    <w:r>
-                      <w:rPr>
-                        <w:rFonts w:ascii="Calibri" w:eastAsia="Calibri" w:hAnsi="Calibri" w:cs="Calibri"/>
-                        <w:noProof/>
-                        <w:color w:val="000000"/>
-                        <w:sz w:val="20"/>
-                        <w:szCs w:val="20"/>
-                      </w:rPr>
-                      <w:t>Official Use Only</w:t>
-                    </w:r>
-                  </w:p>
-                </w:txbxContent>
-              </v:textbox>
-              <w10:wrap anchorx="page" anchory="page"/>
-            </v:shape>
-          </w:pict>
-        </mc:Fallback>
-      </mc:AlternateContent>
-    </w:r>
   </w:p>
 </w:ftr>
 </file>
@@ -2898,127 +5761,6 @@
     <w:pPr>
       <w:pStyle w:val="Footer"/>
     </w:pPr>
-    <w:r>
-      <w:rPr>
-        <w:noProof/>
-      </w:rPr>
-      <mc:AlternateContent>
-        <mc:Choice Requires="wps">
-          <w:drawing>
-            <wp:anchor distT="0" distB="0" distL="0" distR="0" simplePos="0" relativeHeight="251658240" behindDoc="0" locked="0" layoutInCell="1" allowOverlap="1" wp14:anchorId="749D4CCD" wp14:editId="0A28D5B4">
-              <wp:simplePos x="635" y="635"/>
-              <wp:positionH relativeFrom="page">
-                <wp:align>right</wp:align>
-              </wp:positionH>
-              <wp:positionV relativeFrom="page">
-                <wp:align>bottom</wp:align>
-              </wp:positionV>
-              <wp:extent cx="1102995" cy="370205"/>
-              <wp:effectExtent l="0" t="0" r="0" b="0"/>
-              <wp:wrapNone/>
-              <wp:docPr id="1435017991" name="Text Box 1" descr="Official Use Only">
-                <a:extLst xmlns:a="http://schemas.openxmlformats.org/drawingml/2006/main">
-                  <a:ext uri="{5AE41FA2-C0FF-4470-9BD4-5FADCA87CBE2}">
-                    <aclsh:classification xmlns:aclsh="http://schemas.microsoft.com/office/drawing/2020/classificationShape" classificationOutcomeType="ftr"/>
-                  </a:ext>
-                </a:extLst>
-              </wp:docPr>
-              <wp:cNvGraphicFramePr/>
-              <a:graphic xmlns:a="http://schemas.openxmlformats.org/drawingml/2006/main">
-                <a:graphicData uri="http://schemas.microsoft.com/office/word/2010/wordprocessingShape">
-                  <wps:wsp>
-                    <wps:cNvSpPr txBox="1"/>
-                    <wps:spPr>
-                      <a:xfrm>
-                        <a:off x="0" y="0"/>
-                        <a:ext cx="1102995" cy="370205"/>
-                      </a:xfrm>
-                      <a:prstGeom prst="rect">
-                        <a:avLst/>
-                      </a:prstGeom>
-                      <a:noFill/>
-                      <a:ln>
-                        <a:noFill/>
-                      </a:ln>
-                    </wps:spPr>
-                    <wps:txbx>
-                      <w:txbxContent>
-                        <w:p>
-                          <w:pPr>
-                            <w:spacing w:after="0"/>
-                            <w:rPr>
-                              <w:rFonts w:ascii="Calibri" w:eastAsia="Calibri" w:hAnsi="Calibri" w:cs="Calibri"/>
-                              <w:noProof/>
-                              <w:color w:val="000000"/>
-                              <w:sz w:val="20"/>
-                              <w:szCs w:val="20"/>
-                            </w:rPr>
-                          </w:pPr>
-                          <w:r>
-                            <w:rPr>
-                              <w:rFonts w:ascii="Calibri" w:eastAsia="Calibri" w:hAnsi="Calibri" w:cs="Calibri"/>
-                              <w:noProof/>
-                              <w:color w:val="000000"/>
-                              <w:sz w:val="20"/>
-                              <w:szCs w:val="20"/>
-                            </w:rPr>
-                            <w:t>Official Use Only</w:t>
-                          </w:r>
-                        </w:p>
-                      </w:txbxContent>
-                    </wps:txbx>
-                    <wps:bodyPr rot="0" spcFirstLastPara="0" vertOverflow="overflow" horzOverflow="overflow" vert="horz" wrap="none" lIns="0" tIns="0" rIns="254000" bIns="190500" numCol="1" spcCol="0" rtlCol="0" fromWordArt="0" anchor="b" anchorCtr="0" forceAA="0" compatLnSpc="1">
-                      <a:prstTxWarp prst="textNoShape">
-                        <a:avLst/>
-                      </a:prstTxWarp>
-                      <a:spAutoFit/>
-                    </wps:bodyPr>
-                  </wps:wsp>
-                </a:graphicData>
-              </a:graphic>
-            </wp:anchor>
-          </w:drawing>
-        </mc:Choice>
-        <mc:Fallback>
-          <w:pict>
-            <v:shapetype w14:anchorId="749D4CCD" id="_x0000_t202" coordsize="21600,21600" o:spt="202" path="m,l,21600r21600,l21600,xe">
-              <v:stroke joinstyle="miter"/>
-              <v:path gradientshapeok="t" o:connecttype="rect"/>
-            </v:shapetype>
-            <v:shape id="Text Box 1" o:spid="_x0000_s1027" type="#_x0000_t202" alt="Official Use Only" style="position:absolute;margin-left:35.65pt;margin-top:0;width:86.85pt;height:29.15pt;z-index:251658240;visibility:visible;mso-wrap-style:none;mso-wrap-distance-left:0;mso-wrap-distance-top:0;mso-wrap-distance-right:0;mso-wrap-distance-bottom:0;mso-position-horizontal:right;mso-position-horizontal-relative:page;mso-position-vertical:bottom;mso-position-vertical-relative:page;v-text-anchor:bottom" o:gfxdata="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" filled="f" stroked="f">
-              <v:fill o:detectmouseclick="t"/>
-              <v:textbox style="mso-fit-shape-to-text:t" inset="0,0,20pt,15pt">
-                <w:txbxContent>
-                  <w:p>
-                    <w:pPr>
-                      <w:spacing w:after="0"/>
-                      <w:rPr>
-                        <w:rFonts w:ascii="Calibri" w:eastAsia="Calibri" w:hAnsi="Calibri" w:cs="Calibri"/>
-                        <w:noProof/>
-                        <w:color w:val="000000"/>
-                        <w:sz w:val="20"/>
-                        <w:szCs w:val="20"/>
-                      </w:rPr>
-                    </w:pPr>
-                    <w:r>
-                      <w:rPr>
-                        <w:rFonts w:ascii="Calibri" w:eastAsia="Calibri" w:hAnsi="Calibri" w:cs="Calibri"/>
-                        <w:noProof/>
-                        <w:color w:val="000000"/>
-                        <w:sz w:val="20"/>
-                        <w:szCs w:val="20"/>
-                      </w:rPr>
-                      <w:t>Official Use Only</w:t>
-                    </w:r>
-                  </w:p>
-                </w:txbxContent>
-              </v:textbox>
-              <w10:wrap anchorx="page" anchory="page"/>
-            </v:shape>
-          </w:pict>
-        </mc:Fallback>
-      </mc:AlternateContent>
-    </w:r>
   </w:p>
 </w:ftr>
 </file>
@@ -3200,6 +5942,304 @@
     </w:lvl>
   </w:abstractNum>
   <w:abstractNum w:abstractNumId="1" w15:restartNumberingAfterBreak="0">
+    <w:nsid w:val="140537EE"/>
+    <w:multiLevelType w:val="multilevel"/>
+    <w:tmpl w:val="DB82C3FE"/>
+    <w:lvl w:ilvl="0">
+      <w:start w:val="1"/>
+      <w:numFmt w:val="bullet"/>
+      <w:lvlText w:val=""/>
+      <w:lvlJc w:val="left"/>
+      <w:pPr>
+        <w:tabs>
+          <w:tab w:val="num" w:pos="720"/>
+        </w:tabs>
+        <w:ind w:left="720" w:hanging="360"/>
+      </w:pPr>
+      <w:rPr>
+        <w:rFonts w:ascii="Symbol" w:hAnsi="Symbol" w:hint="default"/>
+        <w:sz w:val="20"/>
+      </w:rPr>
+    </w:lvl>
+    <w:lvl w:ilvl="1" w:tentative="1">
+      <w:start w:val="1"/>
+      <w:numFmt w:val="bullet"/>
+      <w:lvlText w:val="o"/>
+      <w:lvlJc w:val="left"/>
+      <w:pPr>
+        <w:tabs>
+          <w:tab w:val="num" w:pos="1440"/>
+        </w:tabs>
+        <w:ind w:left="1440" w:hanging="360"/>
+      </w:pPr>
+      <w:rPr>
+        <w:rFonts w:ascii="Courier New" w:hAnsi="Courier New" w:hint="default"/>
+        <w:sz w:val="20"/>
+      </w:rPr>
+    </w:lvl>
+    <w:lvl w:ilvl="2" w:tentative="1">
+      <w:start w:val="1"/>
+      <w:numFmt w:val="bullet"/>
+      <w:lvlText w:val=""/>
+      <w:lvlJc w:val="left"/>
+      <w:pPr>
+        <w:tabs>
+          <w:tab w:val="num" w:pos="2160"/>
+        </w:tabs>
+        <w:ind w:left="2160" w:hanging="360"/>
+      </w:pPr>
+      <w:rPr>
+        <w:rFonts w:ascii="Wingdings" w:hAnsi="Wingdings" w:hint="default"/>
+        <w:sz w:val="20"/>
+      </w:rPr>
+    </w:lvl>
+    <w:lvl w:ilvl="3" w:tentative="1">
+      <w:start w:val="1"/>
+      <w:numFmt w:val="bullet"/>
+      <w:lvlText w:val=""/>
+      <w:lvlJc w:val="left"/>
+      <w:pPr>
+        <w:tabs>
+          <w:tab w:val="num" w:pos="2880"/>
+        </w:tabs>
+        <w:ind w:left="2880" w:hanging="360"/>
+      </w:pPr>
+      <w:rPr>
+        <w:rFonts w:ascii="Wingdings" w:hAnsi="Wingdings" w:hint="default"/>
+        <w:sz w:val="20"/>
+      </w:rPr>
+    </w:lvl>
+    <w:lvl w:ilvl="4" w:tentative="1">
+      <w:start w:val="1"/>
+      <w:numFmt w:val="bullet"/>
+      <w:lvlText w:val=""/>
+      <w:lvlJc w:val="left"/>
+      <w:pPr>
+        <w:tabs>
+          <w:tab w:val="num" w:pos="3600"/>
+        </w:tabs>
+        <w:ind w:left="3600" w:hanging="360"/>
+      </w:pPr>
+      <w:rPr>
+        <w:rFonts w:ascii="Wingdings" w:hAnsi="Wingdings" w:hint="default"/>
+        <w:sz w:val="20"/>
+      </w:rPr>
+    </w:lvl>
+    <w:lvl w:ilvl="5" w:tentative="1">
+      <w:start w:val="1"/>
+      <w:numFmt w:val="bullet"/>
+      <w:lvlText w:val=""/>
+      <w:lvlJc w:val="left"/>
+      <w:pPr>
+        <w:tabs>
+          <w:tab w:val="num" w:pos="4320"/>
+        </w:tabs>
+        <w:ind w:left="4320" w:hanging="360"/>
+      </w:pPr>
+      <w:rPr>
+        <w:rFonts w:ascii="Wingdings" w:hAnsi="Wingdings" w:hint="default"/>
+        <w:sz w:val="20"/>
+      </w:rPr>
+    </w:lvl>
+    <w:lvl w:ilvl="6" w:tentative="1">
+      <w:start w:val="1"/>
+      <w:numFmt w:val="bullet"/>
+      <w:lvlText w:val=""/>
+      <w:lvlJc w:val="left"/>
+      <w:pPr>
+        <w:tabs>
+          <w:tab w:val="num" w:pos="5040"/>
+        </w:tabs>
+        <w:ind w:left="5040" w:hanging="360"/>
+      </w:pPr>
+      <w:rPr>
+        <w:rFonts w:ascii="Wingdings" w:hAnsi="Wingdings" w:hint="default"/>
+        <w:sz w:val="20"/>
+      </w:rPr>
+    </w:lvl>
+    <w:lvl w:ilvl="7" w:tentative="1">
+      <w:start w:val="1"/>
+      <w:numFmt w:val="bullet"/>
+      <w:lvlText w:val=""/>
+      <w:lvlJc w:val="left"/>
+      <w:pPr>
+        <w:tabs>
+          <w:tab w:val="num" w:pos="5760"/>
+        </w:tabs>
+        <w:ind w:left="5760" w:hanging="360"/>
+      </w:pPr>
+      <w:rPr>
+        <w:rFonts w:ascii="Wingdings" w:hAnsi="Wingdings" w:hint="default"/>
+        <w:sz w:val="20"/>
+      </w:rPr>
+    </w:lvl>
+    <w:lvl w:ilvl="8" w:tentative="1">
+      <w:start w:val="1"/>
+      <w:numFmt w:val="bullet"/>
+      <w:lvlText w:val=""/>
+      <w:lvlJc w:val="left"/>
+      <w:pPr>
+        <w:tabs>
+          <w:tab w:val="num" w:pos="6480"/>
+        </w:tabs>
+        <w:ind w:left="6480" w:hanging="360"/>
+      </w:pPr>
+      <w:rPr>
+        <w:rFonts w:ascii="Wingdings" w:hAnsi="Wingdings" w:hint="default"/>
+        <w:sz w:val="20"/>
+      </w:rPr>
+    </w:lvl>
+  </w:abstractNum>
+  <w:abstractNum w:abstractNumId="2" w15:restartNumberingAfterBreak="0">
+    <w:nsid w:val="145C3892"/>
+    <w:multiLevelType w:val="multilevel"/>
+    <w:tmpl w:val="E56C0BFA"/>
+    <w:lvl w:ilvl="0">
+      <w:start w:val="1"/>
+      <w:numFmt w:val="bullet"/>
+      <w:lvlText w:val=""/>
+      <w:lvlJc w:val="left"/>
+      <w:pPr>
+        <w:tabs>
+          <w:tab w:val="num" w:pos="720"/>
+        </w:tabs>
+        <w:ind w:left="720" w:hanging="360"/>
+      </w:pPr>
+      <w:rPr>
+        <w:rFonts w:ascii="Symbol" w:hAnsi="Symbol" w:hint="default"/>
+        <w:sz w:val="20"/>
+      </w:rPr>
+    </w:lvl>
+    <w:lvl w:ilvl="1" w:tentative="1">
+      <w:start w:val="1"/>
+      <w:numFmt w:val="bullet"/>
+      <w:lvlText w:val="o"/>
+      <w:lvlJc w:val="left"/>
+      <w:pPr>
+        <w:tabs>
+          <w:tab w:val="num" w:pos="1440"/>
+        </w:tabs>
+        <w:ind w:left="1440" w:hanging="360"/>
+      </w:pPr>
+      <w:rPr>
+        <w:rFonts w:ascii="Courier New" w:hAnsi="Courier New" w:hint="default"/>
+        <w:sz w:val="20"/>
+      </w:rPr>
+    </w:lvl>
+    <w:lvl w:ilvl="2" w:tentative="1">
+      <w:start w:val="1"/>
+      <w:numFmt w:val="bullet"/>
+      <w:lvlText w:val=""/>
+      <w:lvlJc w:val="left"/>
+      <w:pPr>
+        <w:tabs>
+          <w:tab w:val="num" w:pos="2160"/>
+        </w:tabs>
+        <w:ind w:left="2160" w:hanging="360"/>
+      </w:pPr>
+      <w:rPr>
+        <w:rFonts w:ascii="Wingdings" w:hAnsi="Wingdings" w:hint="default"/>
+        <w:sz w:val="20"/>
+      </w:rPr>
+    </w:lvl>
+    <w:lvl w:ilvl="3" w:tentative="1">
+      <w:start w:val="1"/>
+      <w:numFmt w:val="bullet"/>
+      <w:lvlText w:val=""/>
+      <w:lvlJc w:val="left"/>
+      <w:pPr>
+        <w:tabs>
+          <w:tab w:val="num" w:pos="2880"/>
+        </w:tabs>
+        <w:ind w:left="2880" w:hanging="360"/>
+      </w:pPr>
+      <w:rPr>
+        <w:rFonts w:ascii="Wingdings" w:hAnsi="Wingdings" w:hint="default"/>
+        <w:sz w:val="20"/>
+      </w:rPr>
+    </w:lvl>
+    <w:lvl w:ilvl="4" w:tentative="1">
+      <w:start w:val="1"/>
+      <w:numFmt w:val="bullet"/>
+      <w:lvlText w:val=""/>
+      <w:lvlJc w:val="left"/>
+      <w:pPr>
+        <w:tabs>
+          <w:tab w:val="num" w:pos="3600"/>
+        </w:tabs>
+        <w:ind w:left="3600" w:hanging="360"/>
+      </w:pPr>
+      <w:rPr>
+        <w:rFonts w:ascii="Wingdings" w:hAnsi="Wingdings" w:hint="default"/>
+        <w:sz w:val="20"/>
+      </w:rPr>
+    </w:lvl>
+    <w:lvl w:ilvl="5" w:tentative="1">
+      <w:start w:val="1"/>
+      <w:numFmt w:val="bullet"/>
+      <w:lvlText w:val=""/>
+      <w:lvlJc w:val="left"/>
+      <w:pPr>
+        <w:tabs>
+          <w:tab w:val="num" w:pos="4320"/>
+        </w:tabs>
+        <w:ind w:left="4320" w:hanging="360"/>
+      </w:pPr>
+      <w:rPr>
+        <w:rFonts w:ascii="Wingdings" w:hAnsi="Wingdings" w:hint="default"/>
+        <w:sz w:val="20"/>
+      </w:rPr>
+    </w:lvl>
+    <w:lvl w:ilvl="6" w:tentative="1">
+      <w:start w:val="1"/>
+      <w:numFmt w:val="bullet"/>
+      <w:lvlText w:val=""/>
+      <w:lvlJc w:val="left"/>
+      <w:pPr>
+        <w:tabs>
+          <w:tab w:val="num" w:pos="5040"/>
+        </w:tabs>
+        <w:ind w:left="5040" w:hanging="360"/>
+      </w:pPr>
+      <w:rPr>
+        <w:rFonts w:ascii="Wingdings" w:hAnsi="Wingdings" w:hint="default"/>
+        <w:sz w:val="20"/>
+      </w:rPr>
+    </w:lvl>
+    <w:lvl w:ilvl="7" w:tentative="1">
+      <w:start w:val="1"/>
+      <w:numFmt w:val="bullet"/>
+      <w:lvlText w:val=""/>
+      <w:lvlJc w:val="left"/>
+      <w:pPr>
+        <w:tabs>
+          <w:tab w:val="num" w:pos="5760"/>
+        </w:tabs>
+        <w:ind w:left="5760" w:hanging="360"/>
+      </w:pPr>
+      <w:rPr>
+        <w:rFonts w:ascii="Wingdings" w:hAnsi="Wingdings" w:hint="default"/>
+        <w:sz w:val="20"/>
+      </w:rPr>
+    </w:lvl>
+    <w:lvl w:ilvl="8" w:tentative="1">
+      <w:start w:val="1"/>
+      <w:numFmt w:val="bullet"/>
+      <w:lvlText w:val=""/>
+      <w:lvlJc w:val="left"/>
+      <w:pPr>
+        <w:tabs>
+          <w:tab w:val="num" w:pos="6480"/>
+        </w:tabs>
+        <w:ind w:left="6480" w:hanging="360"/>
+      </w:pPr>
+      <w:rPr>
+        <w:rFonts w:ascii="Wingdings" w:hAnsi="Wingdings" w:hint="default"/>
+        <w:sz w:val="20"/>
+      </w:rPr>
+    </w:lvl>
+  </w:abstractNum>
+  <w:abstractNum w:abstractNumId="3" w15:restartNumberingAfterBreak="0">
     <w:nsid w:val="1AAB4755"/>
     <w:multiLevelType w:val="multilevel"/>
     <w:tmpl w:val="9F307FE6"/>
@@ -3348,7 +6388,7 @@
       </w:rPr>
     </w:lvl>
   </w:abstractNum>
-  <w:abstractNum w:abstractNumId="2" w15:restartNumberingAfterBreak="0">
+  <w:abstractNum w:abstractNumId="4" w15:restartNumberingAfterBreak="0">
     <w:nsid w:val="1D810F7B"/>
     <w:multiLevelType w:val="multilevel"/>
     <w:tmpl w:val="2AEC1CD4"/>
@@ -3497,7 +6537,156 @@
       </w:rPr>
     </w:lvl>
   </w:abstractNum>
-  <w:abstractNum w:abstractNumId="3" w15:restartNumberingAfterBreak="0">
+  <w:abstractNum w:abstractNumId="5" w15:restartNumberingAfterBreak="0">
+    <w:nsid w:val="2BED687B"/>
+    <w:multiLevelType w:val="multilevel"/>
+    <w:tmpl w:val="013225D6"/>
+    <w:lvl w:ilvl="0">
+      <w:start w:val="1"/>
+      <w:numFmt w:val="bullet"/>
+      <w:lvlText w:val=""/>
+      <w:lvlJc w:val="left"/>
+      <w:pPr>
+        <w:tabs>
+          <w:tab w:val="num" w:pos="720"/>
+        </w:tabs>
+        <w:ind w:left="720" w:hanging="360"/>
+      </w:pPr>
+      <w:rPr>
+        <w:rFonts w:ascii="Symbol" w:hAnsi="Symbol" w:hint="default"/>
+        <w:sz w:val="20"/>
+      </w:rPr>
+    </w:lvl>
+    <w:lvl w:ilvl="1" w:tentative="1">
+      <w:start w:val="1"/>
+      <w:numFmt w:val="bullet"/>
+      <w:lvlText w:val="o"/>
+      <w:lvlJc w:val="left"/>
+      <w:pPr>
+        <w:tabs>
+          <w:tab w:val="num" w:pos="1440"/>
+        </w:tabs>
+        <w:ind w:left="1440" w:hanging="360"/>
+      </w:pPr>
+      <w:rPr>
+        <w:rFonts w:ascii="Courier New" w:hAnsi="Courier New" w:hint="default"/>
+        <w:sz w:val="20"/>
+      </w:rPr>
+    </w:lvl>
+    <w:lvl w:ilvl="2" w:tentative="1">
+      <w:start w:val="1"/>
+      <w:numFmt w:val="bullet"/>
+      <w:lvlText w:val=""/>
+      <w:lvlJc w:val="left"/>
+      <w:pPr>
+        <w:tabs>
+          <w:tab w:val="num" w:pos="2160"/>
+        </w:tabs>
+        <w:ind w:left="2160" w:hanging="360"/>
+      </w:pPr>
+      <w:rPr>
+        <w:rFonts w:ascii="Wingdings" w:hAnsi="Wingdings" w:hint="default"/>
+        <w:sz w:val="20"/>
+      </w:rPr>
+    </w:lvl>
+    <w:lvl w:ilvl="3" w:tentative="1">
+      <w:start w:val="1"/>
+      <w:numFmt w:val="bullet"/>
+      <w:lvlText w:val=""/>
+      <w:lvlJc w:val="left"/>
+      <w:pPr>
+        <w:tabs>
+          <w:tab w:val="num" w:pos="2880"/>
+        </w:tabs>
+        <w:ind w:left="2880" w:hanging="360"/>
+      </w:pPr>
+      <w:rPr>
+        <w:rFonts w:ascii="Wingdings" w:hAnsi="Wingdings" w:hint="default"/>
+        <w:sz w:val="20"/>
+      </w:rPr>
+    </w:lvl>
+    <w:lvl w:ilvl="4" w:tentative="1">
+      <w:start w:val="1"/>
+      <w:numFmt w:val="bullet"/>
+      <w:lvlText w:val=""/>
+      <w:lvlJc w:val="left"/>
+      <w:pPr>
+        <w:tabs>
+          <w:tab w:val="num" w:pos="3600"/>
+        </w:tabs>
+        <w:ind w:left="3600" w:hanging="360"/>
+      </w:pPr>
+      <w:rPr>
+        <w:rFonts w:ascii="Wingdings" w:hAnsi="Wingdings" w:hint="default"/>
+        <w:sz w:val="20"/>
+      </w:rPr>
+    </w:lvl>
+    <w:lvl w:ilvl="5" w:tentative="1">
+      <w:start w:val="1"/>
+      <w:numFmt w:val="bullet"/>
+      <w:lvlText w:val=""/>
+      <w:lvlJc w:val="left"/>
+      <w:pPr>
+        <w:tabs>
+          <w:tab w:val="num" w:pos="4320"/>
+        </w:tabs>
+        <w:ind w:left="4320" w:hanging="360"/>
+      </w:pPr>
+      <w:rPr>
+        <w:rFonts w:ascii="Wingdings" w:hAnsi="Wingdings" w:hint="default"/>
+        <w:sz w:val="20"/>
+      </w:rPr>
+    </w:lvl>
+    <w:lvl w:ilvl="6" w:tentative="1">
+      <w:start w:val="1"/>
+      <w:numFmt w:val="bullet"/>
+      <w:lvlText w:val=""/>
+      <w:lvlJc w:val="left"/>
+      <w:pPr>
+        <w:tabs>
+          <w:tab w:val="num" w:pos="5040"/>
+        </w:tabs>
+        <w:ind w:left="5040" w:hanging="360"/>
+      </w:pPr>
+      <w:rPr>
+        <w:rFonts w:ascii="Wingdings" w:hAnsi="Wingdings" w:hint="default"/>
+        <w:sz w:val="20"/>
+      </w:rPr>
+    </w:lvl>
+    <w:lvl w:ilvl="7" w:tentative="1">
+      <w:start w:val="1"/>
+      <w:numFmt w:val="bullet"/>
+      <w:lvlText w:val=""/>
+      <w:lvlJc w:val="left"/>
+      <w:pPr>
+        <w:tabs>
+          <w:tab w:val="num" w:pos="5760"/>
+        </w:tabs>
+        <w:ind w:left="5760" w:hanging="360"/>
+      </w:pPr>
+      <w:rPr>
+        <w:rFonts w:ascii="Wingdings" w:hAnsi="Wingdings" w:hint="default"/>
+        <w:sz w:val="20"/>
+      </w:rPr>
+    </w:lvl>
+    <w:lvl w:ilvl="8" w:tentative="1">
+      <w:start w:val="1"/>
+      <w:numFmt w:val="bullet"/>
+      <w:lvlText w:val=""/>
+      <w:lvlJc w:val="left"/>
+      <w:pPr>
+        <w:tabs>
+          <w:tab w:val="num" w:pos="6480"/>
+        </w:tabs>
+        <w:ind w:left="6480" w:hanging="360"/>
+      </w:pPr>
+      <w:rPr>
+        <w:rFonts w:ascii="Wingdings" w:hAnsi="Wingdings" w:hint="default"/>
+        <w:sz w:val="20"/>
+      </w:rPr>
+    </w:lvl>
+  </w:abstractNum>
+  <w:abstractNum w:abstractNumId="6" w15:restartNumberingAfterBreak="0">
     <w:nsid w:val="301541E6"/>
     <w:multiLevelType w:val="multilevel"/>
     <w:tmpl w:val="CCD230C8"/>
@@ -3646,7 +6835,7 @@
       </w:rPr>
     </w:lvl>
   </w:abstractNum>
-  <w:abstractNum w:abstractNumId="4" w15:restartNumberingAfterBreak="0">
+  <w:abstractNum w:abstractNumId="7" w15:restartNumberingAfterBreak="0">
     <w:nsid w:val="329373CD"/>
     <w:multiLevelType w:val="multilevel"/>
     <w:tmpl w:val="9B34A572"/>
@@ -3759,7 +6948,156 @@
       </w:pPr>
     </w:lvl>
   </w:abstractNum>
-  <w:abstractNum w:abstractNumId="5" w15:restartNumberingAfterBreak="0">
+  <w:abstractNum w:abstractNumId="8" w15:restartNumberingAfterBreak="0">
+    <w:nsid w:val="38F72546"/>
+    <w:multiLevelType w:val="multilevel"/>
+    <w:tmpl w:val="3FDA155E"/>
+    <w:lvl w:ilvl="0">
+      <w:start w:val="1"/>
+      <w:numFmt w:val="bullet"/>
+      <w:lvlText w:val=""/>
+      <w:lvlJc w:val="left"/>
+      <w:pPr>
+        <w:tabs>
+          <w:tab w:val="num" w:pos="720"/>
+        </w:tabs>
+        <w:ind w:left="720" w:hanging="360"/>
+      </w:pPr>
+      <w:rPr>
+        <w:rFonts w:ascii="Symbol" w:hAnsi="Symbol" w:hint="default"/>
+        <w:sz w:val="20"/>
+      </w:rPr>
+    </w:lvl>
+    <w:lvl w:ilvl="1" w:tentative="1">
+      <w:start w:val="1"/>
+      <w:numFmt w:val="bullet"/>
+      <w:lvlText w:val="o"/>
+      <w:lvlJc w:val="left"/>
+      <w:pPr>
+        <w:tabs>
+          <w:tab w:val="num" w:pos="1440"/>
+        </w:tabs>
+        <w:ind w:left="1440" w:hanging="360"/>
+      </w:pPr>
+      <w:rPr>
+        <w:rFonts w:ascii="Courier New" w:hAnsi="Courier New" w:hint="default"/>
+        <w:sz w:val="20"/>
+      </w:rPr>
+    </w:lvl>
+    <w:lvl w:ilvl="2" w:tentative="1">
+      <w:start w:val="1"/>
+      <w:numFmt w:val="bullet"/>
+      <w:lvlText w:val=""/>
+      <w:lvlJc w:val="left"/>
+      <w:pPr>
+        <w:tabs>
+          <w:tab w:val="num" w:pos="2160"/>
+        </w:tabs>
+        <w:ind w:left="2160" w:hanging="360"/>
+      </w:pPr>
+      <w:rPr>
+        <w:rFonts w:ascii="Wingdings" w:hAnsi="Wingdings" w:hint="default"/>
+        <w:sz w:val="20"/>
+      </w:rPr>
+    </w:lvl>
+    <w:lvl w:ilvl="3" w:tentative="1">
+      <w:start w:val="1"/>
+      <w:numFmt w:val="bullet"/>
+      <w:lvlText w:val=""/>
+      <w:lvlJc w:val="left"/>
+      <w:pPr>
+        <w:tabs>
+          <w:tab w:val="num" w:pos="2880"/>
+        </w:tabs>
+        <w:ind w:left="2880" w:hanging="360"/>
+      </w:pPr>
+      <w:rPr>
+        <w:rFonts w:ascii="Wingdings" w:hAnsi="Wingdings" w:hint="default"/>
+        <w:sz w:val="20"/>
+      </w:rPr>
+    </w:lvl>
+    <w:lvl w:ilvl="4" w:tentative="1">
+      <w:start w:val="1"/>
+      <w:numFmt w:val="bullet"/>
+      <w:lvlText w:val=""/>
+      <w:lvlJc w:val="left"/>
+      <w:pPr>
+        <w:tabs>
+          <w:tab w:val="num" w:pos="3600"/>
+        </w:tabs>
+        <w:ind w:left="3600" w:hanging="360"/>
+      </w:pPr>
+      <w:rPr>
+        <w:rFonts w:ascii="Wingdings" w:hAnsi="Wingdings" w:hint="default"/>
+        <w:sz w:val="20"/>
+      </w:rPr>
+    </w:lvl>
+    <w:lvl w:ilvl="5" w:tentative="1">
+      <w:start w:val="1"/>
+      <w:numFmt w:val="bullet"/>
+      <w:lvlText w:val=""/>
+      <w:lvlJc w:val="left"/>
+      <w:pPr>
+        <w:tabs>
+          <w:tab w:val="num" w:pos="4320"/>
+        </w:tabs>
+        <w:ind w:left="4320" w:hanging="360"/>
+      </w:pPr>
+      <w:rPr>
+        <w:rFonts w:ascii="Wingdings" w:hAnsi="Wingdings" w:hint="default"/>
+        <w:sz w:val="20"/>
+      </w:rPr>
+    </w:lvl>
+    <w:lvl w:ilvl="6" w:tentative="1">
+      <w:start w:val="1"/>
+      <w:numFmt w:val="bullet"/>
+      <w:lvlText w:val=""/>
+      <w:lvlJc w:val="left"/>
+      <w:pPr>
+        <w:tabs>
+          <w:tab w:val="num" w:pos="5040"/>
+        </w:tabs>
+        <w:ind w:left="5040" w:hanging="360"/>
+      </w:pPr>
+      <w:rPr>
+        <w:rFonts w:ascii="Wingdings" w:hAnsi="Wingdings" w:hint="default"/>
+        <w:sz w:val="20"/>
+      </w:rPr>
+    </w:lvl>
+    <w:lvl w:ilvl="7" w:tentative="1">
+      <w:start w:val="1"/>
+      <w:numFmt w:val="bullet"/>
+      <w:lvlText w:val=""/>
+      <w:lvlJc w:val="left"/>
+      <w:pPr>
+        <w:tabs>
+          <w:tab w:val="num" w:pos="5760"/>
+        </w:tabs>
+        <w:ind w:left="5760" w:hanging="360"/>
+      </w:pPr>
+      <w:rPr>
+        <w:rFonts w:ascii="Wingdings" w:hAnsi="Wingdings" w:hint="default"/>
+        <w:sz w:val="20"/>
+      </w:rPr>
+    </w:lvl>
+    <w:lvl w:ilvl="8" w:tentative="1">
+      <w:start w:val="1"/>
+      <w:numFmt w:val="bullet"/>
+      <w:lvlText w:val=""/>
+      <w:lvlJc w:val="left"/>
+      <w:pPr>
+        <w:tabs>
+          <w:tab w:val="num" w:pos="6480"/>
+        </w:tabs>
+        <w:ind w:left="6480" w:hanging="360"/>
+      </w:pPr>
+      <w:rPr>
+        <w:rFonts w:ascii="Wingdings" w:hAnsi="Wingdings" w:hint="default"/>
+        <w:sz w:val="20"/>
+      </w:rPr>
+    </w:lvl>
+  </w:abstractNum>
+  <w:abstractNum w:abstractNumId="9" w15:restartNumberingAfterBreak="0">
     <w:nsid w:val="478E468B"/>
     <w:multiLevelType w:val="multilevel"/>
     <w:tmpl w:val="FF5E7F88"/>
@@ -3908,7 +7246,156 @@
       </w:rPr>
     </w:lvl>
   </w:abstractNum>
-  <w:abstractNum w:abstractNumId="6" w15:restartNumberingAfterBreak="0">
+  <w:abstractNum w:abstractNumId="10" w15:restartNumberingAfterBreak="0">
+    <w:nsid w:val="5029000E"/>
+    <w:multiLevelType w:val="multilevel"/>
+    <w:tmpl w:val="7F986B7E"/>
+    <w:lvl w:ilvl="0">
+      <w:start w:val="1"/>
+      <w:numFmt w:val="bullet"/>
+      <w:lvlText w:val=""/>
+      <w:lvlJc w:val="left"/>
+      <w:pPr>
+        <w:tabs>
+          <w:tab w:val="num" w:pos="720"/>
+        </w:tabs>
+        <w:ind w:left="720" w:hanging="360"/>
+      </w:pPr>
+      <w:rPr>
+        <w:rFonts w:ascii="Symbol" w:hAnsi="Symbol" w:hint="default"/>
+        <w:sz w:val="20"/>
+      </w:rPr>
+    </w:lvl>
+    <w:lvl w:ilvl="1" w:tentative="1">
+      <w:start w:val="1"/>
+      <w:numFmt w:val="bullet"/>
+      <w:lvlText w:val="o"/>
+      <w:lvlJc w:val="left"/>
+      <w:pPr>
+        <w:tabs>
+          <w:tab w:val="num" w:pos="1440"/>
+        </w:tabs>
+        <w:ind w:left="1440" w:hanging="360"/>
+      </w:pPr>
+      <w:rPr>
+        <w:rFonts w:ascii="Courier New" w:hAnsi="Courier New" w:hint="default"/>
+        <w:sz w:val="20"/>
+      </w:rPr>
+    </w:lvl>
+    <w:lvl w:ilvl="2" w:tentative="1">
+      <w:start w:val="1"/>
+      <w:numFmt w:val="bullet"/>
+      <w:lvlText w:val=""/>
+      <w:lvlJc w:val="left"/>
+      <w:pPr>
+        <w:tabs>
+          <w:tab w:val="num" w:pos="2160"/>
+        </w:tabs>
+        <w:ind w:left="2160" w:hanging="360"/>
+      </w:pPr>
+      <w:rPr>
+        <w:rFonts w:ascii="Wingdings" w:hAnsi="Wingdings" w:hint="default"/>
+        <w:sz w:val="20"/>
+      </w:rPr>
+    </w:lvl>
+    <w:lvl w:ilvl="3" w:tentative="1">
+      <w:start w:val="1"/>
+      <w:numFmt w:val="bullet"/>
+      <w:lvlText w:val=""/>
+      <w:lvlJc w:val="left"/>
+      <w:pPr>
+        <w:tabs>
+          <w:tab w:val="num" w:pos="2880"/>
+        </w:tabs>
+        <w:ind w:left="2880" w:hanging="360"/>
+      </w:pPr>
+      <w:rPr>
+        <w:rFonts w:ascii="Wingdings" w:hAnsi="Wingdings" w:hint="default"/>
+        <w:sz w:val="20"/>
+      </w:rPr>
+    </w:lvl>
+    <w:lvl w:ilvl="4" w:tentative="1">
+      <w:start w:val="1"/>
+      <w:numFmt w:val="bullet"/>
+      <w:lvlText w:val=""/>
+      <w:lvlJc w:val="left"/>
+      <w:pPr>
+        <w:tabs>
+          <w:tab w:val="num" w:pos="3600"/>
+        </w:tabs>
+        <w:ind w:left="3600" w:hanging="360"/>
+      </w:pPr>
+      <w:rPr>
+        <w:rFonts w:ascii="Wingdings" w:hAnsi="Wingdings" w:hint="default"/>
+        <w:sz w:val="20"/>
+      </w:rPr>
+    </w:lvl>
+    <w:lvl w:ilvl="5" w:tentative="1">
+      <w:start w:val="1"/>
+      <w:numFmt w:val="bullet"/>
+      <w:lvlText w:val=""/>
+      <w:lvlJc w:val="left"/>
+      <w:pPr>
+        <w:tabs>
+          <w:tab w:val="num" w:pos="4320"/>
+        </w:tabs>
+        <w:ind w:left="4320" w:hanging="360"/>
+      </w:pPr>
+      <w:rPr>
+        <w:rFonts w:ascii="Wingdings" w:hAnsi="Wingdings" w:hint="default"/>
+        <w:sz w:val="20"/>
+      </w:rPr>
+    </w:lvl>
+    <w:lvl w:ilvl="6" w:tentative="1">
+      <w:start w:val="1"/>
+      <w:numFmt w:val="bullet"/>
+      <w:lvlText w:val=""/>
+      <w:lvlJc w:val="left"/>
+      <w:pPr>
+        <w:tabs>
+          <w:tab w:val="num" w:pos="5040"/>
+        </w:tabs>
+        <w:ind w:left="5040" w:hanging="360"/>
+      </w:pPr>
+      <w:rPr>
+        <w:rFonts w:ascii="Wingdings" w:hAnsi="Wingdings" w:hint="default"/>
+        <w:sz w:val="20"/>
+      </w:rPr>
+    </w:lvl>
+    <w:lvl w:ilvl="7" w:tentative="1">
+      <w:start w:val="1"/>
+      <w:numFmt w:val="bullet"/>
+      <w:lvlText w:val=""/>
+      <w:lvlJc w:val="left"/>
+      <w:pPr>
+        <w:tabs>
+          <w:tab w:val="num" w:pos="5760"/>
+        </w:tabs>
+        <w:ind w:left="5760" w:hanging="360"/>
+      </w:pPr>
+      <w:rPr>
+        <w:rFonts w:ascii="Wingdings" w:hAnsi="Wingdings" w:hint="default"/>
+        <w:sz w:val="20"/>
+      </w:rPr>
+    </w:lvl>
+    <w:lvl w:ilvl="8" w:tentative="1">
+      <w:start w:val="1"/>
+      <w:numFmt w:val="bullet"/>
+      <w:lvlText w:val=""/>
+      <w:lvlJc w:val="left"/>
+      <w:pPr>
+        <w:tabs>
+          <w:tab w:val="num" w:pos="6480"/>
+        </w:tabs>
+        <w:ind w:left="6480" w:hanging="360"/>
+      </w:pPr>
+      <w:rPr>
+        <w:rFonts w:ascii="Wingdings" w:hAnsi="Wingdings" w:hint="default"/>
+        <w:sz w:val="20"/>
+      </w:rPr>
+    </w:lvl>
+  </w:abstractNum>
+  <w:abstractNum w:abstractNumId="11" w15:restartNumberingAfterBreak="0">
     <w:nsid w:val="585876B7"/>
     <w:multiLevelType w:val="multilevel"/>
     <w:tmpl w:val="339C52A0"/>
@@ -4057,26 +7544,345 @@
       </w:rPr>
     </w:lvl>
   </w:abstractNum>
+  <w:abstractNum w:abstractNumId="12" w15:restartNumberingAfterBreak="0">
+    <w:nsid w:val="6177647F"/>
+    <w:multiLevelType w:val="multilevel"/>
+    <w:tmpl w:val="3BDCF73C"/>
+    <w:lvl w:ilvl="0">
+      <w:start w:val="1"/>
+      <w:numFmt w:val="bullet"/>
+      <w:lvlText w:val=""/>
+      <w:lvlJc w:val="left"/>
+      <w:pPr>
+        <w:tabs>
+          <w:tab w:val="num" w:pos="720"/>
+        </w:tabs>
+        <w:ind w:left="720" w:hanging="360"/>
+      </w:pPr>
+      <w:rPr>
+        <w:rFonts w:ascii="Symbol" w:hAnsi="Symbol" w:hint="default"/>
+        <w:sz w:val="20"/>
+      </w:rPr>
+    </w:lvl>
+    <w:lvl w:ilvl="1" w:tentative="1">
+      <w:start w:val="1"/>
+      <w:numFmt w:val="bullet"/>
+      <w:lvlText w:val="o"/>
+      <w:lvlJc w:val="left"/>
+      <w:pPr>
+        <w:tabs>
+          <w:tab w:val="num" w:pos="1440"/>
+        </w:tabs>
+        <w:ind w:left="1440" w:hanging="360"/>
+      </w:pPr>
+      <w:rPr>
+        <w:rFonts w:ascii="Courier New" w:hAnsi="Courier New" w:hint="default"/>
+        <w:sz w:val="20"/>
+      </w:rPr>
+    </w:lvl>
+    <w:lvl w:ilvl="2" w:tentative="1">
+      <w:start w:val="1"/>
+      <w:numFmt w:val="bullet"/>
+      <w:lvlText w:val=""/>
+      <w:lvlJc w:val="left"/>
+      <w:pPr>
+        <w:tabs>
+          <w:tab w:val="num" w:pos="2160"/>
+        </w:tabs>
+        <w:ind w:left="2160" w:hanging="360"/>
+      </w:pPr>
+      <w:rPr>
+        <w:rFonts w:ascii="Wingdings" w:hAnsi="Wingdings" w:hint="default"/>
+        <w:sz w:val="20"/>
+      </w:rPr>
+    </w:lvl>
+    <w:lvl w:ilvl="3" w:tentative="1">
+      <w:start w:val="1"/>
+      <w:numFmt w:val="bullet"/>
+      <w:lvlText w:val=""/>
+      <w:lvlJc w:val="left"/>
+      <w:pPr>
+        <w:tabs>
+          <w:tab w:val="num" w:pos="2880"/>
+        </w:tabs>
+        <w:ind w:left="2880" w:hanging="360"/>
+      </w:pPr>
+      <w:rPr>
+        <w:rFonts w:ascii="Wingdings" w:hAnsi="Wingdings" w:hint="default"/>
+        <w:sz w:val="20"/>
+      </w:rPr>
+    </w:lvl>
+    <w:lvl w:ilvl="4" w:tentative="1">
+      <w:start w:val="1"/>
+      <w:numFmt w:val="bullet"/>
+      <w:lvlText w:val=""/>
+      <w:lvlJc w:val="left"/>
+      <w:pPr>
+        <w:tabs>
+          <w:tab w:val="num" w:pos="3600"/>
+        </w:tabs>
+        <w:ind w:left="3600" w:hanging="360"/>
+      </w:pPr>
+      <w:rPr>
+        <w:rFonts w:ascii="Wingdings" w:hAnsi="Wingdings" w:hint="default"/>
+        <w:sz w:val="20"/>
+      </w:rPr>
+    </w:lvl>
+    <w:lvl w:ilvl="5" w:tentative="1">
+      <w:start w:val="1"/>
+      <w:numFmt w:val="bullet"/>
+      <w:lvlText w:val=""/>
+      <w:lvlJc w:val="left"/>
+      <w:pPr>
+        <w:tabs>
+          <w:tab w:val="num" w:pos="4320"/>
+        </w:tabs>
+        <w:ind w:left="4320" w:hanging="360"/>
+      </w:pPr>
+      <w:rPr>
+        <w:rFonts w:ascii="Wingdings" w:hAnsi="Wingdings" w:hint="default"/>
+        <w:sz w:val="20"/>
+      </w:rPr>
+    </w:lvl>
+    <w:lvl w:ilvl="6" w:tentative="1">
+      <w:start w:val="1"/>
+      <w:numFmt w:val="bullet"/>
+      <w:lvlText w:val=""/>
+      <w:lvlJc w:val="left"/>
+      <w:pPr>
+        <w:tabs>
+          <w:tab w:val="num" w:pos="5040"/>
+        </w:tabs>
+        <w:ind w:left="5040" w:hanging="360"/>
+      </w:pPr>
+      <w:rPr>
+        <w:rFonts w:ascii="Wingdings" w:hAnsi="Wingdings" w:hint="default"/>
+        <w:sz w:val="20"/>
+      </w:rPr>
+    </w:lvl>
+    <w:lvl w:ilvl="7" w:tentative="1">
+      <w:start w:val="1"/>
+      <w:numFmt w:val="bullet"/>
+      <w:lvlText w:val=""/>
+      <w:lvlJc w:val="left"/>
+      <w:pPr>
+        <w:tabs>
+          <w:tab w:val="num" w:pos="5760"/>
+        </w:tabs>
+        <w:ind w:left="5760" w:hanging="360"/>
+      </w:pPr>
+      <w:rPr>
+        <w:rFonts w:ascii="Wingdings" w:hAnsi="Wingdings" w:hint="default"/>
+        <w:sz w:val="20"/>
+      </w:rPr>
+    </w:lvl>
+    <w:lvl w:ilvl="8" w:tentative="1">
+      <w:start w:val="1"/>
+      <w:numFmt w:val="bullet"/>
+      <w:lvlText w:val=""/>
+      <w:lvlJc w:val="left"/>
+      <w:pPr>
+        <w:tabs>
+          <w:tab w:val="num" w:pos="6480"/>
+        </w:tabs>
+        <w:ind w:left="6480" w:hanging="360"/>
+      </w:pPr>
+      <w:rPr>
+        <w:rFonts w:ascii="Wingdings" w:hAnsi="Wingdings" w:hint="default"/>
+        <w:sz w:val="20"/>
+      </w:rPr>
+    </w:lvl>
+  </w:abstractNum>
+  <w:abstractNum w:abstractNumId="13" w15:restartNumberingAfterBreak="0">
+    <w:nsid w:val="69275A9F"/>
+    <w:multiLevelType w:val="multilevel"/>
+    <w:tmpl w:val="C06A472C"/>
+    <w:lvl w:ilvl="0">
+      <w:start w:val="1"/>
+      <w:numFmt w:val="bullet"/>
+      <w:lvlText w:val=""/>
+      <w:lvlJc w:val="left"/>
+      <w:pPr>
+        <w:tabs>
+          <w:tab w:val="num" w:pos="720"/>
+        </w:tabs>
+        <w:ind w:left="720" w:hanging="360"/>
+      </w:pPr>
+      <w:rPr>
+        <w:rFonts w:ascii="Symbol" w:hAnsi="Symbol" w:hint="default"/>
+        <w:sz w:val="20"/>
+      </w:rPr>
+    </w:lvl>
+    <w:lvl w:ilvl="1" w:tentative="1">
+      <w:start w:val="1"/>
+      <w:numFmt w:val="bullet"/>
+      <w:lvlText w:val="o"/>
+      <w:lvlJc w:val="left"/>
+      <w:pPr>
+        <w:tabs>
+          <w:tab w:val="num" w:pos="1440"/>
+        </w:tabs>
+        <w:ind w:left="1440" w:hanging="360"/>
+      </w:pPr>
+      <w:rPr>
+        <w:rFonts w:ascii="Courier New" w:hAnsi="Courier New" w:hint="default"/>
+        <w:sz w:val="20"/>
+      </w:rPr>
+    </w:lvl>
+    <w:lvl w:ilvl="2" w:tentative="1">
+      <w:start w:val="1"/>
+      <w:numFmt w:val="bullet"/>
+      <w:lvlText w:val=""/>
+      <w:lvlJc w:val="left"/>
+      <w:pPr>
+        <w:tabs>
+          <w:tab w:val="num" w:pos="2160"/>
+        </w:tabs>
+        <w:ind w:left="2160" w:hanging="360"/>
+      </w:pPr>
+      <w:rPr>
+        <w:rFonts w:ascii="Wingdings" w:hAnsi="Wingdings" w:hint="default"/>
+        <w:sz w:val="20"/>
+      </w:rPr>
+    </w:lvl>
+    <w:lvl w:ilvl="3" w:tentative="1">
+      <w:start w:val="1"/>
+      <w:numFmt w:val="bullet"/>
+      <w:lvlText w:val=""/>
+      <w:lvlJc w:val="left"/>
+      <w:pPr>
+        <w:tabs>
+          <w:tab w:val="num" w:pos="2880"/>
+        </w:tabs>
+        <w:ind w:left="2880" w:hanging="360"/>
+      </w:pPr>
+      <w:rPr>
+        <w:rFonts w:ascii="Wingdings" w:hAnsi="Wingdings" w:hint="default"/>
+        <w:sz w:val="20"/>
+      </w:rPr>
+    </w:lvl>
+    <w:lvl w:ilvl="4" w:tentative="1">
+      <w:start w:val="1"/>
+      <w:numFmt w:val="bullet"/>
+      <w:lvlText w:val=""/>
+      <w:lvlJc w:val="left"/>
+      <w:pPr>
+        <w:tabs>
+          <w:tab w:val="num" w:pos="3600"/>
+        </w:tabs>
+        <w:ind w:left="3600" w:hanging="360"/>
+      </w:pPr>
+      <w:rPr>
+        <w:rFonts w:ascii="Wingdings" w:hAnsi="Wingdings" w:hint="default"/>
+        <w:sz w:val="20"/>
+      </w:rPr>
+    </w:lvl>
+    <w:lvl w:ilvl="5" w:tentative="1">
+      <w:start w:val="1"/>
+      <w:numFmt w:val="bullet"/>
+      <w:lvlText w:val=""/>
+      <w:lvlJc w:val="left"/>
+      <w:pPr>
+        <w:tabs>
+          <w:tab w:val="num" w:pos="4320"/>
+        </w:tabs>
+        <w:ind w:left="4320" w:hanging="360"/>
+      </w:pPr>
+      <w:rPr>
+        <w:rFonts w:ascii="Wingdings" w:hAnsi="Wingdings" w:hint="default"/>
+        <w:sz w:val="20"/>
+      </w:rPr>
+    </w:lvl>
+    <w:lvl w:ilvl="6" w:tentative="1">
+      <w:start w:val="1"/>
+      <w:numFmt w:val="bullet"/>
+      <w:lvlText w:val=""/>
+      <w:lvlJc w:val="left"/>
+      <w:pPr>
+        <w:tabs>
+          <w:tab w:val="num" w:pos="5040"/>
+        </w:tabs>
+        <w:ind w:left="5040" w:hanging="360"/>
+      </w:pPr>
+      <w:rPr>
+        <w:rFonts w:ascii="Wingdings" w:hAnsi="Wingdings" w:hint="default"/>
+        <w:sz w:val="20"/>
+      </w:rPr>
+    </w:lvl>
+    <w:lvl w:ilvl="7" w:tentative="1">
+      <w:start w:val="1"/>
+      <w:numFmt w:val="bullet"/>
+      <w:lvlText w:val=""/>
+      <w:lvlJc w:val="left"/>
+      <w:pPr>
+        <w:tabs>
+          <w:tab w:val="num" w:pos="5760"/>
+        </w:tabs>
+        <w:ind w:left="5760" w:hanging="360"/>
+      </w:pPr>
+      <w:rPr>
+        <w:rFonts w:ascii="Wingdings" w:hAnsi="Wingdings" w:hint="default"/>
+        <w:sz w:val="20"/>
+      </w:rPr>
+    </w:lvl>
+    <w:lvl w:ilvl="8" w:tentative="1">
+      <w:start w:val="1"/>
+      <w:numFmt w:val="bullet"/>
+      <w:lvlText w:val=""/>
+      <w:lvlJc w:val="left"/>
+      <w:pPr>
+        <w:tabs>
+          <w:tab w:val="num" w:pos="6480"/>
+        </w:tabs>
+        <w:ind w:left="6480" w:hanging="360"/>
+      </w:pPr>
+      <w:rPr>
+        <w:rFonts w:ascii="Wingdings" w:hAnsi="Wingdings" w:hint="default"/>
+        <w:sz w:val="20"/>
+      </w:rPr>
+    </w:lvl>
+  </w:abstractNum>
   <w:num w:numId="1" w16cid:durableId="708143639">
-    <w:abstractNumId w:val="2"/>
+    <w:abstractNumId w:val="4"/>
   </w:num>
   <w:num w:numId="2" w16cid:durableId="1119488295">
-    <w:abstractNumId w:val="4"/>
+    <w:abstractNumId w:val="7"/>
   </w:num>
   <w:num w:numId="3" w16cid:durableId="614169518">
-    <w:abstractNumId w:val="6"/>
+    <w:abstractNumId w:val="11"/>
   </w:num>
   <w:num w:numId="4" w16cid:durableId="109471859">
-    <w:abstractNumId w:val="1"/>
+    <w:abstractNumId w:val="3"/>
   </w:num>
   <w:num w:numId="5" w16cid:durableId="233778723">
-    <w:abstractNumId w:val="5"/>
+    <w:abstractNumId w:val="9"/>
   </w:num>
   <w:num w:numId="6" w16cid:durableId="2036533908">
-    <w:abstractNumId w:val="3"/>
+    <w:abstractNumId w:val="6"/>
   </w:num>
   <w:num w:numId="7" w16cid:durableId="1491212660">
     <w:abstractNumId w:val="0"/>
+  </w:num>
+  <w:num w:numId="8" w16cid:durableId="374431780">
+    <w:abstractNumId w:val="10"/>
+  </w:num>
+  <w:num w:numId="9" w16cid:durableId="523830716">
+    <w:abstractNumId w:val="12"/>
+  </w:num>
+  <w:num w:numId="10" w16cid:durableId="2051302048">
+    <w:abstractNumId w:val="8"/>
+  </w:num>
+  <w:num w:numId="11" w16cid:durableId="1894000739">
+    <w:abstractNumId w:val="13"/>
+  </w:num>
+  <w:num w:numId="12" w16cid:durableId="1162309576">
+    <w:abstractNumId w:val="1"/>
+  </w:num>
+  <w:num w:numId="13" w16cid:durableId="1531722773">
+    <w:abstractNumId w:val="2"/>
+  </w:num>
+  <w:num w:numId="14" w16cid:durableId="2119566389">
+    <w:abstractNumId w:val="5"/>
   </w:num>
 </w:numbering>
 </file>
@@ -4684,7 +8490,6 @@
   <w:style w:type="character" w:default="1" w:styleId="DefaultParagraphFont">
     <w:name w:val="Default Paragraph Font"/>
     <w:uiPriority w:val="1"/>
-    <w:semiHidden/>
     <w:unhideWhenUsed/>
   </w:style>
   <w:style w:type="table" w:default="1" w:styleId="TableNormal">
@@ -5042,6 +8847,25 @@
     <w:uiPriority w:val="99"/>
     <w:rsid w:val="009B3B82"/>
   </w:style>
+  <w:style w:type="table" w:styleId="TableGrid">
+    <w:name w:val="Table Grid"/>
+    <w:basedOn w:val="TableNormal"/>
+    <w:uiPriority w:val="39"/>
+    <w:rsid w:val="00AF519D"/>
+    <w:pPr>
+      <w:spacing w:after="0" w:line="240" w:lineRule="auto"/>
+    </w:pPr>
+    <w:tblPr>
+      <w:tblBorders>
+        <w:top w:val="single" w:sz="4" w:space="0" w:color="auto"/>
+        <w:left w:val="single" w:sz="4" w:space="0" w:color="auto"/>
+        <w:bottom w:val="single" w:sz="4" w:space="0" w:color="auto"/>
+        <w:right w:val="single" w:sz="4" w:space="0" w:color="auto"/>
+        <w:insideH w:val="single" w:sz="4" w:space="0" w:color="auto"/>
+        <w:insideV w:val="single" w:sz="4" w:space="0" w:color="auto"/>
+      </w:tblBorders>
+    </w:tblPr>
+  </w:style>
 </w:styles>
 </file>
 

</xml_diff>